<commit_message>
chore: update changelog script with date range support and new changelog
Co-Authored-By: Claude Opus 4.6 (1M context) <noreply@anthropic.com>
</commit_message>
<xml_diff>
--- a/docs/changelog_2026-04-22.docx
+++ b/docs/changelog_2026-04-22.docx
@@ -96,13 +96,13 @@
           <w:color w:val="3A9FD6"/>
           <w:sz w:val="16"/>
         </w:rPr>
-        <w:t xml:space="preserve">[CHORE] </w:t>
+        <w:t xml:space="preserve">[NEW] </w:t>
       </w:r>
       <w:r>
         <w:rPr>
           <w:sz w:val="18"/>
         </w:rPr>
-        <w:t>Rename documentation/ to docs/ with prompts and design subfolders</w:t>
+        <w:t>Google Calendar import UI with coachee + event-type match</w:t>
       </w:r>
     </w:p>
     <w:p>
@@ -115,7 +115,7 @@
           <w:color w:val="6B7C93"/>
           <w:sz w:val="16"/>
         </w:rPr>
-        <w:t>Moves all prose documentation into two semantic buckets: prompts/</w:t>
+        <w:t>Coaches can now preview and import existing Google Calendar events</w:t>
       </w:r>
     </w:p>
     <w:p>
@@ -134,7 +134,7 @@
         <w:rPr>
           <w:sz w:val="18"/>
         </w:rPr>
-        <w:t>Coachees menu + full list; dashboard activity moves to admin</w:t>
+        <w:t>Coachee booking stays in the same dialog end-to-end</w:t>
       </w:r>
     </w:p>
     <w:p>
@@ -147,7 +147,7 @@
           <w:color w:val="6B7C93"/>
           <w:sz w:val="16"/>
         </w:rPr>
-        <w:t>Sidebar "Coachees" entry (coach role only) routes to a new</w:t>
+        <w:t>The "Book a session" popup no longer navigates away when the coachee</w:t>
       </w:r>
     </w:p>
     <w:p>
@@ -166,7 +166,7 @@
         <w:rPr>
           <w:sz w:val="18"/>
         </w:rPr>
-        <w:t>Google Calendar import UI with coachee + event-type match</w:t>
+        <w:t>Coachee cancel/reschedule with message; swap googleapis</w:t>
       </w:r>
     </w:p>
     <w:p>
@@ -179,7 +179,7 @@
           <w:color w:val="6B7C93"/>
           <w:sz w:val="16"/>
         </w:rPr>
-        <w:t>Coaches can now preview and import existing Google Calendar events</w:t>
+        <w:t>Coachees can now cancel and reschedule their own sessions from the</w:t>
       </w:r>
     </w:p>
     <w:p>
@@ -192,13 +192,146 @@
           <w:color w:val="3A9FD6"/>
           <w:sz w:val="16"/>
         </w:rPr>
+        <w:t xml:space="preserve">[FIX] </w:t>
+      </w:r>
+      <w:r>
+        <w:rPr>
+          <w:sz w:val="18"/>
+        </w:rPr>
+        <w:t>Propagate cancellation to attendee calendars</w:t>
+      </w:r>
+    </w:p>
+    <w:p>
+      <w:pPr>
+        <w:pStyle w:val="ListBullet"/>
+      </w:pPr>
+      <w:r>
+        <w:rPr>
+          <w:b/>
+          <w:color w:val="3A9FD6"/>
+          <w:sz w:val="16"/>
+        </w:rPr>
         <w:t xml:space="preserve">[NEW] </w:t>
       </w:r>
       <w:r>
         <w:rPr>
           <w:sz w:val="18"/>
         </w:rPr>
-        <w:t>Coachee booking stays in the same dialog end-to-end</w:t>
+        <w:t>Import calendar picker + current-month default; fix session intake completion detection</w:t>
+      </w:r>
+    </w:p>
+    <w:p>
+      <w:pPr>
+        <w:pStyle w:val="ListBullet"/>
+      </w:pPr>
+      <w:r>
+        <w:rPr>
+          <w:b/>
+          <w:color w:val="3A9FD6"/>
+          <w:sz w:val="16"/>
+        </w:rPr>
+        <w:t xml:space="preserve">[NEW] </w:t>
+      </w:r>
+      <w:r>
+        <w:rPr>
+          <w:sz w:val="18"/>
+        </w:rPr>
+        <w:t>Date exclusions w/ inline calendar, country holidays, autosave</w:t>
+      </w:r>
+    </w:p>
+    <w:p>
+      <w:pPr>
+        <w:pStyle w:val="ListBullet"/>
+      </w:pPr>
+      <w:r>
+        <w:rPr>
+          <w:b/>
+          <w:color w:val="3A9FD6"/>
+          <w:sz w:val="16"/>
+        </w:rPr>
+        <w:t xml:space="preserve">[FIX] </w:t>
+      </w:r>
+      <w:r>
+        <w:rPr>
+          <w:sz w:val="18"/>
+        </w:rPr>
+        <w:t>Tighten schedule rows + validate end-after-start time range</w:t>
+      </w:r>
+    </w:p>
+    <w:p>
+      <w:pPr>
+        <w:pStyle w:val="ListBullet"/>
+      </w:pPr>
+      <w:r>
+        <w:rPr>
+          <w:b/>
+          <w:color w:val="3A9FD6"/>
+          <w:sz w:val="16"/>
+        </w:rPr>
+        <w:t xml:space="preserve">[FIX] </w:t>
+      </w:r>
+      <w:r>
+        <w:rPr>
+          <w:sz w:val="18"/>
+        </w:rPr>
+        <w:t>Center action icons in bookings list</w:t>
+      </w:r>
+    </w:p>
+    <w:p>
+      <w:pPr>
+        <w:pStyle w:val="ListBullet"/>
+      </w:pPr>
+      <w:r>
+        <w:rPr>
+          <w:b/>
+          <w:color w:val="3A9FD6"/>
+          <w:sz w:val="16"/>
+        </w:rPr>
+        <w:t xml:space="preserve">[FIX] </w:t>
+      </w:r>
+      <w:r>
+        <w:rPr>
+          <w:sz w:val="18"/>
+        </w:rPr>
+        <w:t>Vertically center mat-icon inside icon buttons in actions column</w:t>
+      </w:r>
+    </w:p>
+    <w:p>
+      <w:pPr>
+        <w:pStyle w:val="ListBullet"/>
+      </w:pPr>
+      <w:r>
+        <w:rPr>
+          <w:b/>
+          <w:color w:val="3A9FD6"/>
+          <w:sz w:val="16"/>
+        </w:rPr>
+        <w:t xml:space="preserve">[FIX] </w:t>
+      </w:r>
+      <w:r>
+        <w:rPr>
+          <w:sz w:val="18"/>
+        </w:rPr>
+        <w:t>Google Calendar OAuth redirects to booking settings, not general settings</w:t>
+      </w:r>
+    </w:p>
+    <w:p>
+      <w:pPr>
+        <w:pStyle w:val="ListBullet"/>
+      </w:pPr>
+      <w:r>
+        <w:rPr>
+          <w:b/>
+          <w:color w:val="3A9FD6"/>
+          <w:sz w:val="16"/>
+        </w:rPr>
+        <w:t xml:space="preserve">[NEW] </w:t>
+      </w:r>
+      <w:r>
+        <w:rPr>
+          <w:sz w:val="18"/>
+        </w:rPr>
+        <w:t>Google Calendar invite preference, default OFF for all users</w:t>
       </w:r>
     </w:p>
     <w:p>
@@ -211,7 +344,7 @@
           <w:color w:val="6B7C93"/>
           <w:sz w:val="16"/>
         </w:rPr>
-        <w:t>The "Book a session" popup no longer navigates away when the coachee</w:t>
+        <w:t>googleCalendarInvites added to notification preferences (default: false)</w:t>
       </w:r>
     </w:p>
     <w:p>
@@ -224,13 +357,51 @@
           <w:color w:val="3A9FD6"/>
           <w:sz w:val="16"/>
         </w:rPr>
+        <w:t xml:space="preserve">[FIX] </w:t>
+      </w:r>
+      <w:r>
+        <w:rPr>
+          <w:sz w:val="18"/>
+        </w:rPr>
+        <w:t>Auto-wrap all emails in branded ARTES template</w:t>
+      </w:r>
+    </w:p>
+    <w:p>
+      <w:pPr>
+        <w:pStyle w:val="ListBullet"/>
+      </w:pPr>
+      <w:r>
+        <w:rPr>
+          <w:b/>
+          <w:color w:val="3A9FD6"/>
+          <w:sz w:val="16"/>
+        </w:rPr>
+        <w:t xml:space="preserve">[REFACTOR] </w:t>
+      </w:r>
+      <w:r>
+        <w:rPr>
+          <w:sz w:val="18"/>
+        </w:rPr>
+        <w:t>Extract calendar provider abstraction for multi-provider support</w:t>
+      </w:r>
+    </w:p>
+    <w:p>
+      <w:pPr>
+        <w:pStyle w:val="ListBullet"/>
+      </w:pPr>
+      <w:r>
+        <w:rPr>
+          <w:b/>
+          <w:color w:val="3A9FD6"/>
+          <w:sz w:val="16"/>
+        </w:rPr>
         <w:t xml:space="preserve">[NEW] </w:t>
       </w:r>
       <w:r>
         <w:rPr>
           <w:sz w:val="18"/>
         </w:rPr>
-        <w:t>Coachee cancel/reschedule with message; swap googleapis</w:t>
+        <w:t>Office 365 calendar integration (Phase 2)</w:t>
       </w:r>
     </w:p>
     <w:p>
@@ -243,7 +414,7 @@
           <w:color w:val="6B7C93"/>
           <w:sz w:val="16"/>
         </w:rPr>
-        <w:t>Coachees can now cancel and reschedule their own sessions from the</w:t>
+        <w:t>Implements Microsoft Calendar provider using MSAL + Graph API with full</w:t>
       </w:r>
     </w:p>
     <w:p>
@@ -256,13 +427,13 @@
           <w:color w:val="3A9FD6"/>
           <w:sz w:val="16"/>
         </w:rPr>
-        <w:t xml:space="preserve">[FIX] </w:t>
+        <w:t xml:space="preserve">[NEW] </w:t>
       </w:r>
       <w:r>
         <w:rPr>
           <w:sz w:val="18"/>
         </w:rPr>
-        <w:t>Propagate cancellation to attendee calendars</w:t>
+        <w:t>Microsoft webhook subscriptions + provider-aware webhook lifecycle</w:t>
       </w:r>
     </w:p>
     <w:p>
@@ -275,7 +446,7 @@
           <w:color w:val="6B7C93"/>
           <w:sz w:val="16"/>
         </w:rPr>
-        <w:t>Pass sendUpdates:'all' on the GCal delete so Google removes the event</w:t>
+        <w:t>Adds Microsoft Graph change notification handling: subscription</w:t>
       </w:r>
     </w:p>
     <w:p>
@@ -288,13 +459,13 @@
           <w:color w:val="3A9FD6"/>
           <w:sz w:val="16"/>
         </w:rPr>
-        <w:t xml:space="preserve">[REFACTOR] </w:t>
+        <w:t xml:space="preserve">[NEW] </w:t>
       </w:r>
       <w:r>
         <w:rPr>
           <w:sz w:val="18"/>
         </w:rPr>
-        <w:t>IsCoachee flag so any user can also be a coachee</w:t>
+        <w:t>Provider-agnostic booking fields, Teams link display, remove MSAL</w:t>
       </w:r>
     </w:p>
     <w:p>
@@ -307,7 +478,7 @@
           <w:color w:val="6B7C93"/>
           <w:sz w:val="16"/>
         </w:rPr>
-        <w:t>Add User.isCoachee boolean, indexed and defaulting to false. Any user</w:t>
+        <w:t>Adds calendarEventId, calendarProvider, meetingLink fields to Booking</w:t>
       </w:r>
     </w:p>
     <w:p>
@@ -326,7 +497,7 @@
         <w:rPr>
           <w:sz w:val="18"/>
         </w:rPr>
-        <w:t>Org default + per-user override for coachee coach choice</w:t>
+        <w:t>Calendar invites toggle suppresses duplicate booking emails</w:t>
       </w:r>
     </w:p>
     <w:p>
@@ -339,7 +510,7 @@
           <w:color w:val="6B7C93"/>
           <w:sz w:val="16"/>
         </w:rPr>
-        <w:t>Organization.coacheeCanChooseCoach (default true) sets the org-wide</w:t>
+        <w:t>Adds calendarInvites preference (replaces googleCalendarInvites). When ON,</w:t>
       </w:r>
     </w:p>
     <w:p>
@@ -358,7 +529,20 @@
         <w:rPr>
           <w:sz w:val="18"/>
         </w:rPr>
-        <w:t>Import calendar picker + current-month default; fix session intake completion detection</w:t>
+        <w:t>Add reCAPTCHA v3 to login, register, forgot-password, and public booking</w:t>
+      </w:r>
+    </w:p>
+    <w:p>
+      <w:pPr>
+        <w:ind w:left="720"/>
+      </w:pPr>
+      <w:r>
+        <w:rPr>
+          <w:i/>
+          <w:color w:val="6B7C93"/>
+          <w:sz w:val="16"/>
+        </w:rPr>
+        <w:t>Protects public-facing endpoints against bots and abuse. Backend middleware</w:t>
       </w:r>
     </w:p>
     <w:p>
@@ -371,13 +555,28 @@
           <w:color w:val="3A9FD6"/>
           <w:sz w:val="16"/>
         </w:rPr>
-        <w:t xml:space="preserve">[NEW] </w:t>
+        <w:t xml:space="preserve">[FIX] </w:t>
       </w:r>
       <w:r>
         <w:rPr>
           <w:sz w:val="18"/>
         </w:rPr>
-        <w:t>Date exclusions w/ inline calendar, country holidays, autosave</w:t>
+        <w:t>Remove google-services.json from repo, add Book a Session CTA, populate publicSlug</w:t>
+      </w:r>
+    </w:p>
+    <w:p>
+      <w:pPr>
+        <w:pBdr>
+          <w:bottom w:val="single" w:sz="4" w:space="1" w:color="3A9FD6"/>
+        </w:pBdr>
+      </w:pPr>
+      <w:r>
+        <w:rPr>
+          <w:b/>
+          <w:color w:val="1B2A47"/>
+          <w:sz w:val="22"/>
+        </w:rPr>
+        <w:t>Coaching Module</w:t>
       </w:r>
     </w:p>
     <w:p>
@@ -396,7 +595,7 @@
         <w:rPr>
           <w:sz w:val="18"/>
         </w:rPr>
-        <w:t>Tighten schedule rows + validate end-after-start time range</w:t>
+        <w:t>Engagement dialog pulls from /users/coachees</w:t>
       </w:r>
     </w:p>
     <w:p>
@@ -409,13 +608,13 @@
           <w:color w:val="3A9FD6"/>
           <w:sz w:val="16"/>
         </w:rPr>
-        <w:t xml:space="preserve">[NEW] </w:t>
+        <w:t xml:space="preserve">[UI] </w:t>
       </w:r>
       <w:r>
         <w:rPr>
           <w:sz w:val="18"/>
         </w:rPr>
-        <w:t>Reschedule deadline policy, late cancel allotment, coach cancel button, webhook diagnostics</w:t>
+        <w:t>Sponsor column shows "company / name"; sponsors + tile</w:t>
       </w:r>
     </w:p>
     <w:p>
@@ -428,13 +627,13 @@
           <w:color w:val="3A9FD6"/>
           <w:sz w:val="16"/>
         </w:rPr>
-        <w:t xml:space="preserve">[REFACTOR] </w:t>
+        <w:t xml:space="preserve">[NEW] </w:t>
       </w:r>
       <w:r>
         <w:rPr>
           <w:sz w:val="18"/>
         </w:rPr>
-        <w:t>Migrate all routes from requireRole to requirePermission</w:t>
+        <w:t>Coachees menu + full list; dashboard activity moves to admin</w:t>
       </w:r>
     </w:p>
     <w:p>
@@ -447,7 +646,7 @@
           <w:color w:val="6B7C93"/>
           <w:sz w:val="16"/>
         </w:rPr>
-        <w:t>Replaced all hardcoded requireRole() calls with requirePermission() across</w:t>
+        <w:t>Sidebar "Coachees" entry (coach role only) routes to a new</w:t>
       </w:r>
     </w:p>
     <w:p>
@@ -460,13 +659,13 @@
           <w:color w:val="3A9FD6"/>
           <w:sz w:val="16"/>
         </w:rPr>
-        <w:t xml:space="preserve">[UI] </w:t>
+        <w:t xml:space="preserve">[NEW] </w:t>
       </w:r>
       <w:r>
         <w:rPr>
           <w:sz w:val="18"/>
         </w:rPr>
-        <w:t>Rich login carousel with doc-sourced content, workflows, and stats</w:t>
+        <w:t>Coaching module + pre-session intake attached to sessions</w:t>
       </w:r>
     </w:p>
     <w:p>
@@ -479,7 +678,7 @@
           <w:color w:val="6B7C93"/>
           <w:sz w:val="16"/>
         </w:rPr>
-        <w:t>Each module slide now contains:</w:t>
+        <w:t>Add 'coaching' to the SurveyTemplate moduleType enum so intake templates</w:t>
       </w:r>
     </w:p>
     <w:p>
@@ -492,13 +691,13 @@
           <w:color w:val="3A9FD6"/>
           <w:sz w:val="16"/>
         </w:rPr>
-        <w:t xml:space="preserve">[UI] </w:t>
+        <w:t xml:space="preserve">[NEW] </w:t>
       </w:r>
       <w:r>
         <w:rPr>
           <w:sz w:val="18"/>
         </w:rPr>
-        <w:t>Add hero images to login carousel slides</w:t>
+        <w:t>Status filter pills on engagement sessions list</w:t>
       </w:r>
     </w:p>
     <w:p>
@@ -511,7 +710,7 @@
           <w:color w:val="6B7C93"/>
           <w:sz w:val="16"/>
         </w:rPr>
-        <w:t>Each module slide now displays a hero image between the header and</w:t>
+        <w:t>Pills above the sessions timeline â€” Scheduled / Completed / Cancelled /</w:t>
       </w:r>
     </w:p>
     <w:p>
@@ -530,7 +729,7 @@
         <w:rPr>
           <w:sz w:val="18"/>
         </w:rPr>
-        <w:t>Mirror all email communications into message hub notifications</w:t>
+        <w:t>Sponsor column in coachees list</w:t>
       </w:r>
     </w:p>
     <w:p>
@@ -543,7 +742,7 @@
           <w:color w:val="6B7C93"/>
           <w:sz w:val="16"/>
         </w:rPr>
-        <w:t>Created hubNotification.service.ts with helpers for each communication</w:t>
+        <w:t>Populate sponsorId on GET /api/users/coachees (name, email,</w:t>
       </w:r>
     </w:p>
     <w:p>
@@ -556,13 +755,26 @@
           <w:color w:val="3A9FD6"/>
           <w:sz w:val="16"/>
         </w:rPr>
-        <w:t xml:space="preserve">[FIX] </w:t>
+        <w:t xml:space="preserve">[NEW] </w:t>
       </w:r>
       <w:r>
         <w:rPr>
           <w:sz w:val="18"/>
         </w:rPr>
-        <w:t>Center action icons in bookings list</w:t>
+        <w:t>View pre-session intake results from the session card</w:t>
+      </w:r>
+    </w:p>
+    <w:p>
+      <w:pPr>
+        <w:ind w:left="720"/>
+      </w:pPr>
+      <w:r>
+        <w:rPr>
+          <w:i/>
+          <w:color w:val="6B7C93"/>
+          <w:sz w:val="16"/>
+        </w:rPr>
+        <w:t>Completed pre-session intake cards now show a "View results" button for</w:t>
       </w:r>
     </w:p>
     <w:p>
@@ -575,13 +787,26 @@
           <w:color w:val="3A9FD6"/>
           <w:sz w:val="16"/>
         </w:rPr>
-        <w:t xml:space="preserve">[FIX] </w:t>
+        <w:t xml:space="preserve">[NEW] </w:t>
       </w:r>
       <w:r>
         <w:rPr>
           <w:sz w:val="18"/>
         </w:rPr>
-        <w:t>Vertically center mat-icon inside icon buttons in actions column</w:t>
+        <w:t>Org default + per-user override for coachee coach choice</w:t>
+      </w:r>
+    </w:p>
+    <w:p>
+      <w:pPr>
+        <w:ind w:left="720"/>
+      </w:pPr>
+      <w:r>
+        <w:rPr>
+          <w:i/>
+          <w:color w:val="6B7C93"/>
+          <w:sz w:val="16"/>
+        </w:rPr>
+        <w:t>Organization.coacheeCanChooseCoach (default true) sets the org-wide</w:t>
       </w:r>
     </w:p>
     <w:p>
@@ -600,7 +825,45 @@
         <w:rPr>
           <w:sz w:val="18"/>
         </w:rPr>
-        <w:t>Globally center mat-icon-button icons across all components</w:t>
+        <w:t>Scope the coachee journal to a single session when opened from a session card</w:t>
+      </w:r>
+    </w:p>
+    <w:p>
+      <w:pPr>
+        <w:pStyle w:val="ListBullet"/>
+      </w:pPr>
+      <w:r>
+        <w:rPr>
+          <w:b/>
+          <w:color w:val="3A9FD6"/>
+          <w:sz w:val="16"/>
+        </w:rPr>
+        <w:t xml:space="preserve">[FIX] </w:t>
+      </w:r>
+      <w:r>
+        <w:rPr>
+          <w:sz w:val="18"/>
+        </w:rPr>
+        <w:t>'Show all sessions' link â€” react to query-param changes</w:t>
+      </w:r>
+    </w:p>
+    <w:p>
+      <w:pPr>
+        <w:pStyle w:val="ListBullet"/>
+      </w:pPr>
+      <w:r>
+        <w:rPr>
+          <w:b/>
+          <w:color w:val="3A9FD6"/>
+          <w:sz w:val="16"/>
+        </w:rPr>
+        <w:t xml:space="preserve">[NEW] </w:t>
+      </w:r>
+      <w:r>
+        <w:rPr>
+          <w:sz w:val="18"/>
+        </w:rPr>
+        <w:t>Conflict analysis detail page + pre/post session coaching forms</w:t>
       </w:r>
     </w:p>
     <w:p>
@@ -613,7 +876,7 @@
           <w:color w:val="6B7C93"/>
           <w:sz w:val="16"/>
         </w:rPr>
-        <w:t>Added global .mat-mdc-icon-button flex centering rule in styles.scss</w:t>
+        <w:t>Conflict: rename surveyPeriodâ†’name, templateIdâ†’intakeTemplateId (populated)</w:t>
       </w:r>
     </w:p>
     <w:p>
@@ -626,13 +889,32 @@
           <w:color w:val="3A9FD6"/>
           <w:sz w:val="16"/>
         </w:rPr>
-        <w:t xml:space="preserve">[FIX] </w:t>
+        <w:t xml:space="preserve">[NEW] </w:t>
       </w:r>
       <w:r>
         <w:rPr>
           <w:sz w:val="18"/>
         </w:rPr>
-        <w:t>Google Calendar OAuth redirects to booking settings, not general settings</w:t>
+        <w:t>Reschedule deadline policy, late cancel allotment, coach cancel button, webhook diagnostics</w:t>
+      </w:r>
+    </w:p>
+    <w:p>
+      <w:pPr>
+        <w:pStyle w:val="ListBullet"/>
+      </w:pPr>
+      <w:r>
+        <w:rPr>
+          <w:b/>
+          <w:color w:val="3A9FD6"/>
+          <w:sz w:val="16"/>
+        </w:rPr>
+        <w:t xml:space="preserve">[NEW] </w:t>
+      </w:r>
+      <w:r>
+        <w:rPr>
+          <w:sz w:val="18"/>
+        </w:rPr>
+        <w:t>Intake assignments, mobile coachee UX, iOS platform + CI</w:t>
       </w:r>
     </w:p>
     <w:p>
@@ -645,7 +927,7 @@
           <w:color w:val="6B7C93"/>
           <w:sz w:val="16"/>
         </w:rPr>
-        <w:t>Moved security/2FA section from Settings to Profile page</w:t>
+        <w:t>Add intake assignment system: SurveyAssignment model, assign routes</w:t>
       </w:r>
     </w:p>
     <w:p>
@@ -658,13 +940,142 @@
           <w:color w:val="3A9FD6"/>
           <w:sz w:val="16"/>
         </w:rPr>
+        <w:t xml:space="preserve">[FIX] </w:t>
+      </w:r>
+      <w:r>
+        <w:rPr>
+          <w:sz w:val="18"/>
+        </w:rPr>
+        <w:t>Coachee journal 403, pre-session notification, note previews, i18n</w:t>
+      </w:r>
+    </w:p>
+    <w:p>
+      <w:pPr>
+        <w:pBdr>
+          <w:bottom w:val="single" w:sz="4" w:space="1" w:color="3A9FD6"/>
+        </w:pBdr>
+      </w:pPr>
+      <w:r>
+        <w:rPr>
+          <w:b/>
+          <w:color w:val="1B2A47"/>
+          <w:sz w:val="22"/>
+        </w:rPr>
+        <w:t>Conflict Intelligence</w:t>
+      </w:r>
+    </w:p>
+    <w:p>
+      <w:pPr>
+        <w:pStyle w:val="ListBullet"/>
+      </w:pPr>
+      <w:r>
+        <w:rPr>
+          <w:b/>
+          <w:color w:val="3A9FD6"/>
+          <w:sz w:val="16"/>
+        </w:rPr>
+        <w:t xml:space="preserve">[UI] </w:t>
+      </w:r>
+      <w:r>
+        <w:rPr>
+          <w:sz w:val="18"/>
+        </w:rPr>
+        <w:t>Make analysis cards clickable, remove View Details button</w:t>
+      </w:r>
+    </w:p>
+    <w:p>
+      <w:pPr>
+        <w:pStyle w:val="ListBullet"/>
+      </w:pPr>
+      <w:r>
+        <w:rPr>
+          <w:b/>
+          <w:color w:val="3A9FD6"/>
+          <w:sz w:val="16"/>
+        </w:rPr>
+        <w:t xml:space="preserve">[FIX] </w:t>
+      </w:r>
+      <w:r>
+        <w:rPr>
+          <w:sz w:val="18"/>
+        </w:rPr>
+        <w:t>Persist AI recommended actions to database</w:t>
+      </w:r>
+    </w:p>
+    <w:p>
+      <w:pPr>
+        <w:pStyle w:val="ListBullet"/>
+      </w:pPr>
+      <w:r>
+        <w:rPr>
+          <w:b/>
+          <w:color w:val="3A9FD6"/>
+          <w:sz w:val="16"/>
+        </w:rPr>
+        <w:t xml:space="preserve">[UI] </w:t>
+      </w:r>
+      <w:r>
+        <w:rPr>
+          <w:sz w:val="18"/>
+        </w:rPr>
+        <w:t>Accordion layout for recommended actions with completion checkboxes</w:t>
+      </w:r>
+    </w:p>
+    <w:p>
+      <w:pPr>
+        <w:pStyle w:val="ListBullet"/>
+      </w:pPr>
+      <w:r>
+        <w:rPr>
+          <w:b/>
+          <w:color w:val="3A9FD6"/>
+          <w:sz w:val="16"/>
+        </w:rPr>
+        <w:t xml:space="preserve">[FIX] </w:t>
+      </w:r>
+      <w:r>
+        <w:rPr>
+          <w:sz w:val="18"/>
+        </w:rPr>
+        <w:t>Persist action completion checkboxes to database</w:t>
+      </w:r>
+    </w:p>
+    <w:p>
+      <w:pPr>
+        <w:pStyle w:val="ListBullet"/>
+      </w:pPr>
+      <w:r>
+        <w:rPr>
+          <w:b/>
+          <w:color w:val="3A9FD6"/>
+          <w:sz w:val="16"/>
+        </w:rPr>
+        <w:t xml:space="preserve">[UI] </w:t>
+      </w:r>
+      <w:r>
+        <w:rPr>
+          <w:sz w:val="18"/>
+        </w:rPr>
+        <w:t>Paragraph formatting for narratives + collapsible sub-analyses</w:t>
+      </w:r>
+    </w:p>
+    <w:p>
+      <w:pPr>
+        <w:pStyle w:val="ListBullet"/>
+      </w:pPr>
+      <w:r>
+        <w:rPr>
+          <w:b/>
+          <w:color w:val="3A9FD6"/>
+          <w:sz w:val="16"/>
+        </w:rPr>
         <w:t xml:space="preserve">[NEW] </w:t>
       </w:r>
       <w:r>
         <w:rPr>
           <w:sz w:val="18"/>
         </w:rPr>
-        <w:t>Granular notification preferences per user</w:t>
+        <w:t>Add HNP Conflict Handling Style Assessment (HNP-CHS)</w:t>
       </w:r>
     </w:p>
     <w:p>
@@ -677,7 +1088,7 @@
           <w:color w:val="6B7C93"/>
           <w:sz w:val="16"/>
         </w:rPr>
-        <w:t>Added notificationPreferences to User model with 8 categories:</w:t>
+        <w:t>New individual-level instrument (24 items, 6 categories) measuring conflict</w:t>
       </w:r>
     </w:p>
     <w:p>
@@ -690,13 +1101,47 @@
           <w:color w:val="3A9FD6"/>
           <w:sz w:val="16"/>
         </w:rPr>
+        <w:t xml:space="preserve">[CHORE] </w:t>
+      </w:r>
+      <w:r>
+        <w:rPr>
+          <w:sz w:val="18"/>
+        </w:rPr>
+        <w:t>Update todo, conflict design doc, remove stale changelog</w:t>
+      </w:r>
+    </w:p>
+    <w:p>
+      <w:pPr>
+        <w:pBdr>
+          <w:bottom w:val="single" w:sz="4" w:space="1" w:color="3A9FD6"/>
+        </w:pBdr>
+      </w:pPr>
+      <w:r>
+        <w:rPr>
+          <w:b/>
+          <w:color w:val="1B2A47"/>
+          <w:sz w:val="22"/>
+        </w:rPr>
+        <w:t>AI &amp; Intake Instruments</w:t>
+      </w:r>
+    </w:p>
+    <w:p>
+      <w:pPr>
+        <w:pStyle w:val="ListBullet"/>
+      </w:pPr>
+      <w:r>
+        <w:rPr>
+          <w:b/>
+          <w:color w:val="3A9FD6"/>
+          <w:sz w:val="16"/>
+        </w:rPr>
         <w:t xml:space="preserve">[NEW] </w:t>
       </w:r>
       <w:r>
         <w:rPr>
           <w:sz w:val="18"/>
         </w:rPr>
-        <w:t>Google Calendar invite preference, default OFF for all users</w:t>
+        <w:t>Per-template minResponsesForAnalysis gate</w:t>
       </w:r>
     </w:p>
     <w:p>
@@ -709,7 +1154,7 @@
           <w:color w:val="6B7C93"/>
           <w:sz w:val="16"/>
         </w:rPr>
-        <w:t>googleCalendarInvites added to notification preferences (default: false)</w:t>
+        <w:t>Intake templates gain a minResponsesForAnalysis field that controls</w:t>
       </w:r>
     </w:p>
     <w:p>
@@ -722,13 +1167,70 @@
           <w:color w:val="3A9FD6"/>
           <w:sz w:val="16"/>
         </w:rPr>
+        <w:t xml:space="preserve">[CHORE] </w:t>
+      </w:r>
+      <w:r>
+        <w:rPr>
+          <w:sz w:val="18"/>
+        </w:rPr>
+        <w:t>Rename documentation/ to docs/ with prompts and design subfolders</w:t>
+      </w:r>
+    </w:p>
+    <w:p>
+      <w:pPr>
+        <w:pStyle w:val="ListBullet"/>
+      </w:pPr>
+      <w:r>
+        <w:rPr>
+          <w:b/>
+          <w:color w:val="3A9FD6"/>
+          <w:sz w:val="16"/>
+        </w:rPr>
         <w:t xml:space="preserve">[FIX] </w:t>
       </w:r>
       <w:r>
         <w:rPr>
           <w:sz w:val="18"/>
         </w:rPr>
-        <w:t>Auto-wrap all emails in branded ARTES template</w:t>
+        <w:t>Blank open-text field instead of showing the literal 'undefined'</w:t>
+      </w:r>
+    </w:p>
+    <w:p>
+      <w:pPr>
+        <w:pStyle w:val="ListBullet"/>
+      </w:pPr>
+      <w:r>
+        <w:rPr>
+          <w:b/>
+          <w:color w:val="3A9FD6"/>
+          <w:sz w:val="16"/>
+        </w:rPr>
+        <w:t xml:space="preserve">[REFACTOR] </w:t>
+      </w:r>
+      <w:r>
+        <w:rPr>
+          <w:sz w:val="18"/>
+        </w:rPr>
+        <w:t>Shared components + intake link + gauge sizing + budget + warnings</w:t>
+      </w:r>
+    </w:p>
+    <w:p>
+      <w:pPr>
+        <w:pStyle w:val="ListBullet"/>
+      </w:pPr>
+      <w:r>
+        <w:rPr>
+          <w:b/>
+          <w:color w:val="3A9FD6"/>
+          <w:sz w:val="16"/>
+        </w:rPr>
+        <w:t xml:space="preserve">[NEW] </w:t>
+      </w:r>
+      <w:r>
+        <w:rPr>
+          <w:sz w:val="18"/>
+        </w:rPr>
+        <w:t>Intake i18n â€” org language, AI translation, survey language switcher</w:t>
       </w:r>
     </w:p>
     <w:p>
@@ -741,7 +1243,7 @@
           <w:color w:val="6B7C93"/>
           <w:sz w:val="16"/>
         </w:rPr>
-        <w:t>sendEmail() now auto-wraps HTML in the branded template (navy header,</w:t>
+        <w:t>Add defaultLanguage to organization settings</w:t>
       </w:r>
     </w:p>
     <w:p>
@@ -754,13 +1256,13 @@
           <w:color w:val="3A9FD6"/>
           <w:sz w:val="16"/>
         </w:rPr>
-        <w:t xml:space="preserve">[REFACTOR] </w:t>
+        <w:t xml:space="preserve">[NEW] </w:t>
       </w:r>
       <w:r>
         <w:rPr>
           <w:sz w:val="18"/>
         </w:rPr>
-        <w:t>Extract calendar provider abstraction for multi-provider support</w:t>
+        <w:t>AI usage limits, professional review workflow, action intake generation</w:t>
       </w:r>
     </w:p>
     <w:p>
@@ -773,7 +1275,7 @@
           <w:color w:val="6B7C93"/>
           <w:sz w:val="16"/>
         </w:rPr>
-        <w:t>Introduces ICalendarProvider interface with Google implementation, factory</w:t>
+        <w:t>Add per-org monthly AI generation tracking with plan-based limits (402 when exceeded),</w:t>
       </w:r>
     </w:p>
     <w:p>
@@ -792,7 +1294,7 @@
         <w:rPr>
           <w:sz w:val="18"/>
         </w:rPr>
-        <w:t>Office 365 calendar integration (Phase 2)</w:t>
+        <w:t>Custom AI analysis prompt per intake instrument</w:t>
       </w:r>
     </w:p>
     <w:p>
@@ -805,7 +1307,7 @@
           <w:color w:val="6B7C93"/>
           <w:sz w:val="16"/>
         </w:rPr>
-        <w:t>Implements Microsoft Calendar provider using MSAL + Graph API with full</w:t>
+        <w:t>Add analysisPrompt field to SurveyTemplate â€” used as the system prompt</w:t>
       </w:r>
     </w:p>
     <w:p>
@@ -818,13 +1320,66 @@
           <w:color w:val="3A9FD6"/>
           <w:sz w:val="16"/>
         </w:rPr>
+        <w:t xml:space="preserve">[FIX] </w:t>
+      </w:r>
+      <w:r>
+        <w:rPr>
+          <w:sz w:val="18"/>
+        </w:rPr>
+        <w:t>Add VIEW_ALL_USERS and MANAGE_INTAKE_TEMPLATES to coach role</w:t>
+      </w:r>
+    </w:p>
+    <w:p>
+      <w:pPr>
+        <w:pBdr>
+          <w:bottom w:val="single" w:sz="4" w:space="1" w:color="3A9FD6"/>
+        </w:pBdr>
+      </w:pPr>
+      <w:r>
+        <w:rPr>
+          <w:b/>
+          <w:color w:val="1B2A47"/>
+          <w:sz w:val="22"/>
+        </w:rPr>
+        <w:t>Internationalisation (i18n)</w:t>
+      </w:r>
+    </w:p>
+    <w:p>
+      <w:pPr>
+        <w:pStyle w:val="ListBullet"/>
+      </w:pPr>
+      <w:r>
+        <w:rPr>
+          <w:b/>
+          <w:color w:val="3A9FD6"/>
+          <w:sz w:val="16"/>
+        </w:rPr>
+        <w:t xml:space="preserve">[CHORE] </w:t>
+      </w:r>
+      <w:r>
+        <w:rPr>
+          <w:sz w:val="18"/>
+        </w:rPr>
+        <w:t>I18n design doc â€” EN + FR via Claude Code execution</w:t>
+      </w:r>
+    </w:p>
+    <w:p>
+      <w:pPr>
+        <w:pStyle w:val="ListBullet"/>
+      </w:pPr>
+      <w:r>
+        <w:rPr>
+          <w:b/>
+          <w:color w:val="3A9FD6"/>
+          <w:sz w:val="16"/>
+        </w:rPr>
         <w:t xml:space="preserve">[NEW] </w:t>
       </w:r>
       <w:r>
         <w:rPr>
           <w:sz w:val="18"/>
         </w:rPr>
-        <w:t>Microsoft webhook subscriptions + provider-aware webhook lifecycle</w:t>
+        <w:t>Phase 1 â€” foundation (ngx-translate, i18next, schema, switcher)</w:t>
       </w:r>
     </w:p>
     <w:p>
@@ -837,7 +1392,7 @@
           <w:color w:val="6B7C93"/>
           <w:sz w:val="16"/>
         </w:rPr>
-        <w:t>Adds Microsoft Graph change notification handling: subscription</w:t>
+        <w:t>Installs ngx-translate (frontend) and i18next (backend). Adds</w:t>
       </w:r>
     </w:p>
     <w:p>
@@ -856,7 +1411,7 @@
         <w:rPr>
           <w:sz w:val="18"/>
         </w:rPr>
-        <w:t>Provider-agnostic booking fields, Teams link display, remove MSAL</w:t>
+        <w:t>Phase 2 â€” frontend string extraction (873 keys, 96 components)</w:t>
       </w:r>
     </w:p>
     <w:p>
@@ -869,7 +1424,7 @@
           <w:color w:val="6B7C93"/>
           <w:sz w:val="16"/>
         </w:rPr>
-        <w:t>Adds calendarEventId, calendarProvider, meetingLink fields to Booking</w:t>
+        <w:t>Translates all 96 Angular components from hardcoded English to</w:t>
       </w:r>
     </w:p>
     <w:p>
@@ -888,7 +1443,7 @@
         <w:rPr>
           <w:sz w:val="18"/>
         </w:rPr>
-        <w:t>Calendar invites toggle suppresses duplicate booking emails</w:t>
+        <w:t>Phase 2 sweep + Phase 4 + language after login</w:t>
       </w:r>
     </w:p>
     <w:p>
@@ -901,7 +1456,7 @@
           <w:color w:val="6B7C93"/>
           <w:sz w:val="16"/>
         </w:rPr>
-        <w:t>Adds calendarInvites preference (replaces googleCalendarInvites). When ON,</w:t>
+        <w:t>Second pass filling ~320 missing translation keys across booking,</w:t>
       </w:r>
     </w:p>
     <w:p>
@@ -920,7 +1475,7 @@
         <w:rPr>
           <w:sz w:val="18"/>
         </w:rPr>
-        <w:t>Phase 2 â€” frontend string extraction (873 keys, 96 components)</w:t>
+        <w:t>Fix coachees, dashboard cards, sponsors, interview, intakes</w:t>
       </w:r>
     </w:p>
     <w:p>
@@ -933,7 +1488,7 @@
           <w:color w:val="6B7C93"/>
           <w:sz w:val="16"/>
         </w:rPr>
-        <w:t>Translates all 96 Angular components from hardcoded English to</w:t>
+        <w:t>Translates coachees filter pills + table headers, dashboard module cards</w:t>
       </w:r>
     </w:p>
     <w:p>
@@ -952,7 +1507,7 @@
         <w:rPr>
           <w:sz w:val="18"/>
         </w:rPr>
-        <w:t>Phase 2 sweep + Phase 4 + language after login</w:t>
+        <w:t>Spanish language, notification labels, language fix, Phase 6 prep</w:t>
       </w:r>
     </w:p>
     <w:p>
@@ -965,7 +1520,7 @@
           <w:color w:val="6B7C93"/>
           <w:sz w:val="16"/>
         </w:rPr>
-        <w:t>Second pass filling ~320 missing translation keys across booking,</w:t>
+        <w:t>Adds es.json (1576 keys), Spanish backend locale, 'es' in User model</w:t>
       </w:r>
     </w:p>
     <w:p>
@@ -984,7 +1539,7 @@
         <w:rPr>
           <w:sz w:val="18"/>
         </w:rPr>
-        <w:t>Complete Phase 2 + Phase 3 (1920 keys, backend errors + emails)</w:t>
+        <w:t>Phase 6 locale-aware dates/numbers + login language fix</w:t>
       </w:r>
     </w:p>
     <w:p>
@@ -997,7 +1552,7 @@
           <w:color w:val="6B7C93"/>
           <w:sz w:val="16"/>
         </w:rPr>
-        <w:t>Phase 2: translates engagement-detail (filter pills, journal notes, New</w:t>
+        <w:t>Replaces 26 hardcoded locale strings (en-US/en-GB) with dynamic language</w:t>
       </w:r>
     </w:p>
     <w:p>
@@ -1016,7 +1571,7 @@
         <w:rPr>
           <w:sz w:val="18"/>
         </w:rPr>
-        <w:t>Booking schedule days, empty states, exclusion dates, policies</w:t>
+        <w:t>Conflict skill pages, coachee journal, Phase 6</w:t>
       </w:r>
     </w:p>
     <w:p>
@@ -1029,7 +1584,7 @@
           <w:color w:val="6B7C93"/>
           <w:sz w:val="16"/>
         </w:rPr>
-        <w:t>Translates days of week in availability schedule, From/To labels,</w:t>
+        <w:t>Translates conflict-skill-building (frameworks, tools, resources),</w:t>
       </w:r>
     </w:p>
     <w:p>
@@ -1048,7 +1603,7 @@
         <w:rPr>
           <w:sz w:val="18"/>
         </w:rPr>
-        <w:t>Date locale fixes, QA sweep, scattered string fixes</w:t>
+        <w:t>SVG flag picker, engagement-detail fixes, login flags</w:t>
       </w:r>
     </w:p>
     <w:p>
@@ -1061,7 +1616,7 @@
           <w:color w:val="6B7C93"/>
           <w:sz w:val="16"/>
         </w:rPr>
-        <w:t>Fixes 5 date formatting calls with dynamic locale (exclusion dates,</w:t>
+        <w:t>Replaces emoji flags with inline SVG country flags (Windows compat).</w:t>
       </w:r>
     </w:p>
     <w:p>
@@ -1080,7 +1635,26 @@
         <w:rPr>
           <w:sz w:val="18"/>
         </w:rPr>
-        <w:t>Booking reminder email language + survey placeholder</w:t>
+        <w:t>Sidebar flag picker uses DomSanitizer for SVG rendering</w:t>
+      </w:r>
+    </w:p>
+    <w:p>
+      <w:pPr>
+        <w:pStyle w:val="ListBullet"/>
+      </w:pPr>
+      <w:r>
+        <w:rPr>
+          <w:b/>
+          <w:color w:val="3A9FD6"/>
+          <w:sz w:val="16"/>
+        </w:rPr>
+        <w:t xml:space="preserve">[NEW] </w:t>
+      </w:r>
+      <w:r>
+        <w:rPr>
+          <w:sz w:val="18"/>
+        </w:rPr>
+        <w:t>Flag language picker in sidebar using mat-menu</w:t>
       </w:r>
     </w:p>
     <w:p>
@@ -1093,7 +1667,7 @@
           <w:color w:val="6B7C93"/>
           <w:sz w:val="16"/>
         </w:rPr>
-        <w:t>Send reminder emails in the recipient's preferred language instead of</w:t>
+        <w:t>SVG flags rendered directly in template via @switch (no innerHTML).</w:t>
       </w:r>
     </w:p>
     <w:p>
@@ -1112,7 +1686,7 @@
         <w:rPr>
           <w:sz w:val="18"/>
         </w:rPr>
-        <w:t>Add reCAPTCHA v3 to login, register, forgot-password, and public booking</w:t>
+        <w:t>Complete Phase 2 + Phase 3 (1920 keys, backend errors + emails)</w:t>
       </w:r>
     </w:p>
     <w:p>
@@ -1125,7 +1699,7 @@
           <w:color w:val="6B7C93"/>
           <w:sz w:val="16"/>
         </w:rPr>
-        <w:t>Protects public-facing endpoints against bots and abuse. Backend middleware</w:t>
+        <w:t>Phase 2: translates engagement-detail (filter pills, journal notes, New</w:t>
       </w:r>
     </w:p>
     <w:p>
@@ -1144,7 +1718,7 @@
         <w:rPr>
           <w:sz w:val="18"/>
         </w:rPr>
-        <w:t>Add mobile app (Ionic/Capacitor/Angular) with backend push notifications</w:t>
+        <w:t>Booking schedule days, empty states, exclusion dates, policies</w:t>
       </w:r>
     </w:p>
     <w:p>
@@ -1157,7 +1731,7 @@
           <w:color w:val="6B7C93"/>
           <w:sz w:val="16"/>
         </w:rPr>
-        <w:t>Coachee/employee mobile app with 5 tabs: Sessions, Bookings, Surveys, IDP, Notifications.</w:t>
+        <w:t>Translates days of week in availability schedule, From/To labels,</w:t>
       </w:r>
     </w:p>
     <w:p>
@@ -1170,13 +1744,32 @@
           <w:color w:val="3A9FD6"/>
           <w:sz w:val="16"/>
         </w:rPr>
+        <w:t xml:space="preserve">[FIX] </w:t>
+      </w:r>
+      <w:r>
+        <w:rPr>
+          <w:sz w:val="18"/>
+        </w:rPr>
+        <w:t>Req.t fallback for auth routes where i18n middleware hasn't run</w:t>
+      </w:r>
+    </w:p>
+    <w:p>
+      <w:pPr>
+        <w:pStyle w:val="ListBullet"/>
+      </w:pPr>
+      <w:r>
+        <w:rPr>
+          <w:b/>
+          <w:color w:val="3A9FD6"/>
+          <w:sz w:val="16"/>
+        </w:rPr>
         <w:t xml:space="preserve">[NEW] </w:t>
       </w:r>
       <w:r>
         <w:rPr>
           <w:sz w:val="18"/>
         </w:rPr>
-        <w:t>Add offline banner, profile page, confirmation dialogs, haptics</w:t>
+        <w:t>Date locale fixes, QA sweep, scattered string fixes</w:t>
       </w:r>
     </w:p>
     <w:p>
@@ -1189,7 +1782,7 @@
           <w:color w:val="6B7C93"/>
           <w:sz w:val="16"/>
         </w:rPr>
-        <w:t>Offline connectivity banner shows when network is down</w:t>
+        <w:t>Fixes 5 date formatting calls with dynamic locale (exclusion dates,</w:t>
       </w:r>
     </w:p>
     <w:p>
@@ -1208,7 +1801,7 @@
         <w:rPr>
           <w:sz w:val="18"/>
         </w:rPr>
-        <w:t>Coach-selection booking flow, Jest tests, app icon, device build</w:t>
+        <w:t>Legal pages full translation, intake dialog, deep sweep</w:t>
       </w:r>
     </w:p>
     <w:p>
@@ -1221,7 +1814,7 @@
           <w:color w:val="6B7C93"/>
           <w:sz w:val="16"/>
         </w:rPr>
-        <w:t>Booking flow now starts with coach selection from active engagements</w:t>
+        <w:t>Translates all three legal pages (Terms, Privacy, EULA) body text to</w:t>
       </w:r>
     </w:p>
     <w:p>
@@ -1240,7 +1833,98 @@
         <w:rPr>
           <w:sz w:val="18"/>
         </w:rPr>
+        <w:t>Add missing SURVEY translation keys</w:t>
+      </w:r>
+    </w:p>
+    <w:p>
+      <w:pPr>
+        <w:pStyle w:val="ListBullet"/>
+      </w:pPr>
+      <w:r>
+        <w:rPr>
+          <w:b/>
+          <w:color w:val="3A9FD6"/>
+          <w:sz w:val="16"/>
+        </w:rPr>
+        <w:t xml:space="preserve">[FIX] </w:t>
+      </w:r>
+      <w:r>
+        <w:rPr>
+          <w:sz w:val="18"/>
+        </w:rPr>
+        <w:t>Booking reminder email language + survey placeholder</w:t>
+      </w:r>
+    </w:p>
+    <w:p>
+      <w:pPr>
+        <w:pStyle w:val="ListBullet"/>
+      </w:pPr>
+      <w:r>
+        <w:rPr>
+          <w:b/>
+          <w:color w:val="3A9FD6"/>
+          <w:sz w:val="16"/>
+        </w:rPr>
+        <w:t xml:space="preserve">[FIX] </w:t>
+      </w:r>
+      <w:r>
+        <w:rPr>
+          <w:sz w:val="18"/>
+        </w:rPr>
         <w:t>Copy locales to dist on build so i18n works in production</w:t>
+      </w:r>
+    </w:p>
+    <w:p>
+      <w:pPr>
+        <w:pStyle w:val="ListBullet"/>
+      </w:pPr>
+      <w:r>
+        <w:rPr>
+          <w:b/>
+          <w:color w:val="3A9FD6"/>
+          <w:sz w:val="16"/>
+        </w:rPr>
+        <w:t xml:space="preserve">[FIX] </w:t>
+      </w:r>
+      <w:r>
+        <w:rPr>
+          <w:sz w:val="18"/>
+        </w:rPr>
+        <w:t>Add missing translation keys for sponsor billing, org chart, and billing</w:t>
+      </w:r>
+    </w:p>
+    <w:p>
+      <w:pPr>
+        <w:pBdr>
+          <w:bottom w:val="single" w:sz="4" w:space="1" w:color="3A9FD6"/>
+        </w:pBdr>
+      </w:pPr>
+      <w:r>
+        <w:rPr>
+          <w:b/>
+          <w:color w:val="1B2A47"/>
+          <w:sz w:val="22"/>
+        </w:rPr>
+        <w:t>Mobile App (Ionic / Capacitor)</w:t>
+      </w:r>
+    </w:p>
+    <w:p>
+      <w:pPr>
+        <w:pStyle w:val="ListBullet"/>
+      </w:pPr>
+      <w:r>
+        <w:rPr>
+          <w:b/>
+          <w:color w:val="3A9FD6"/>
+          <w:sz w:val="16"/>
+        </w:rPr>
+        <w:t xml:space="preserve">[NEW] </w:t>
+      </w:r>
+      <w:r>
+        <w:rPr>
+          <w:sz w:val="18"/>
+        </w:rPr>
+        <w:t>Add mobile app (Ionic/Capacitor/Angular) with backend push notifications</w:t>
       </w:r>
     </w:p>
     <w:p>
@@ -1253,7 +1937,7 @@
           <w:color w:val="6B7C93"/>
           <w:sz w:val="16"/>
         </w:rPr>
-        <w:t>tsc doesn't copy JSON files â€” locales were missing from dist/ causing</w:t>
+        <w:t>Coachee/employee mobile app with 5 tabs: Sessions, Bookings, Surveys, IDP, Notifications.</w:t>
       </w:r>
     </w:p>
     <w:p>
@@ -1266,13 +1950,13 @@
           <w:color w:val="3A9FD6"/>
           <w:sz w:val="16"/>
         </w:rPr>
-        <w:t xml:space="preserve">[FIX] </w:t>
+        <w:t xml:space="preserve">[NEW] </w:t>
       </w:r>
       <w:r>
         <w:rPr>
           <w:sz w:val="18"/>
         </w:rPr>
-        <w:t>Remove google-services.json from repo, add Book a Session CTA, populate publicSlug</w:t>
+        <w:t>Add offline banner, profile page, confirmation dialogs, haptics</w:t>
       </w:r>
     </w:p>
     <w:p>
@@ -1285,7 +1969,7 @@
           <w:color w:val="6B7C93"/>
           <w:sz w:val="16"/>
         </w:rPr>
-        <w:t>Removed google-services.json from git (secret detected by GitHub)</w:t>
+        <w:t>Offline connectivity banner shows when network is down</w:t>
       </w:r>
     </w:p>
     <w:p>
@@ -1304,7 +1988,7 @@
         <w:rPr>
           <w:sz w:val="18"/>
         </w:rPr>
-        <w:t>Event type selection, pre/post intake forms, proper app icon</w:t>
+        <w:t>Coach-selection booking flow, Jest tests, app icon, device build</w:t>
       </w:r>
     </w:p>
     <w:p>
@@ -1317,7 +2001,7 @@
           <w:color w:val="6B7C93"/>
           <w:sz w:val="16"/>
         </w:rPr>
-        <w:t>Booking flow: Coach â†’ Event Type list â†’ Date â†’ Slot â†’ Confirm</w:t>
+        <w:t>Booking flow now starts with coach selection from active engagements</w:t>
       </w:r>
     </w:p>
     <w:p>
@@ -1330,13 +2014,89 @@
           <w:color w:val="3A9FD6"/>
           <w:sz w:val="16"/>
         </w:rPr>
+        <w:t xml:space="preserve">[FIX] </w:t>
+      </w:r>
+      <w:r>
+        <w:rPr>
+          <w:sz w:val="18"/>
+        </w:rPr>
+        <w:t>Point to production API, add zone.js polyfill, network security config</w:t>
+      </w:r>
+    </w:p>
+    <w:p>
+      <w:pPr>
+        <w:pStyle w:val="ListBullet"/>
+      </w:pPr>
+      <w:r>
+        <w:rPr>
+          <w:b/>
+          <w:color w:val="3A9FD6"/>
+          <w:sz w:val="16"/>
+        </w:rPr>
+        <w:t xml:space="preserve">[FIX] </w:t>
+      </w:r>
+      <w:r>
+        <w:rPr>
+          <w:sz w:val="18"/>
+        </w:rPr>
+        <w:t>Allow Capacitor mobile origins in CORS config</w:t>
+      </w:r>
+    </w:p>
+    <w:p>
+      <w:pPr>
+        <w:pStyle w:val="ListBullet"/>
+      </w:pPr>
+      <w:r>
+        <w:rPr>
+          <w:b/>
+          <w:color w:val="3A9FD6"/>
+          <w:sz w:val="16"/>
+        </w:rPr>
+        <w:t xml:space="preserve">[FIX] </w:t>
+      </w:r>
+      <w:r>
+        <w:rPr>
+          <w:sz w:val="18"/>
+        </w:rPr>
+        <w:t>Skip reCAPTCHA for native mobile app requests</w:t>
+      </w:r>
+    </w:p>
+    <w:p>
+      <w:pPr>
+        <w:pStyle w:val="ListBullet"/>
+      </w:pPr>
+      <w:r>
+        <w:rPr>
+          <w:b/>
+          <w:color w:val="3A9FD6"/>
+          <w:sz w:val="16"/>
+        </w:rPr>
+        <w:t xml:space="preserve">[FIX] </w:t>
+      </w:r>
+      <w:r>
+        <w:rPr>
+          <w:sz w:val="18"/>
+        </w:rPr>
+        <w:t>Disable push registration until Firebase is configured</w:t>
+      </w:r>
+    </w:p>
+    <w:p>
+      <w:pPr>
+        <w:pStyle w:val="ListBullet"/>
+      </w:pPr>
+      <w:r>
+        <w:rPr>
+          <w:b/>
+          <w:color w:val="3A9FD6"/>
+          <w:sz w:val="16"/>
+        </w:rPr>
         <w:t xml:space="preserve">[NEW] </w:t>
       </w:r>
       <w:r>
         <w:rPr>
           <w:sz w:val="18"/>
         </w:rPr>
-        <w:t>Intake assignments, mobile coachee UX, iOS platform + CI</w:t>
+        <w:t>Enable push notifications with Firebase</w:t>
       </w:r>
     </w:p>
     <w:p>
@@ -1349,7 +2109,115 @@
           <w:color w:val="6B7C93"/>
           <w:sz w:val="16"/>
         </w:rPr>
-        <w:t>Add intake assignment system: SurveyAssignment model, assign routes</w:t>
+        <w:t>Added google-services.json, re-enabled PushNotifications.register()</w:t>
+      </w:r>
+    </w:p>
+    <w:p>
+      <w:pPr>
+        <w:pStyle w:val="ListBullet"/>
+      </w:pPr>
+      <w:r>
+        <w:rPr>
+          <w:b/>
+          <w:color w:val="3A9FD6"/>
+          <w:sz w:val="16"/>
+        </w:rPr>
+        <w:t xml:space="preserve">[NEW] </w:t>
+      </w:r>
+      <w:r>
+        <w:rPr>
+          <w:sz w:val="18"/>
+        </w:rPr>
+        <w:t>Event type selection, pre/post intake forms, proper app icon</w:t>
+      </w:r>
+    </w:p>
+    <w:p>
+      <w:pPr>
+        <w:ind w:left="720"/>
+      </w:pPr>
+      <w:r>
+        <w:rPr>
+          <w:i/>
+          <w:color w:val="6B7C93"/>
+          <w:sz w:val="16"/>
+        </w:rPr>
+        <w:t>Booking flow: Coach â†’ Event Type list â†’ Date â†’ Slot â†’ Confirm</w:t>
+      </w:r>
+    </w:p>
+    <w:p>
+      <w:pPr>
+        <w:pStyle w:val="ListBullet"/>
+      </w:pPr>
+      <w:r>
+        <w:rPr>
+          <w:b/>
+          <w:color w:val="3A9FD6"/>
+          <w:sz w:val="16"/>
+        </w:rPr>
+        <w:t xml:space="preserve">[FIX] </w:t>
+      </w:r>
+      <w:r>
+        <w:rPr>
+          <w:sz w:val="18"/>
+        </w:rPr>
+        <w:t>Biometric login only prompts when stored session exists</w:t>
+      </w:r>
+    </w:p>
+    <w:p>
+      <w:pPr>
+        <w:pStyle w:val="ListBullet"/>
+      </w:pPr>
+      <w:r>
+        <w:rPr>
+          <w:b/>
+          <w:color w:val="3A9FD6"/>
+          <w:sz w:val="16"/>
+        </w:rPr>
+        <w:t xml:space="preserve">[FIX] </w:t>
+      </w:r>
+      <w:r>
+        <w:rPr>
+          <w:sz w:val="18"/>
+        </w:rPr>
+        <w:t>Call /auth/logout on sign out to remove login session</w:t>
+      </w:r>
+    </w:p>
+    <w:p>
+      <w:pPr>
+        <w:pStyle w:val="ListBullet"/>
+      </w:pPr>
+      <w:r>
+        <w:rPr>
+          <w:b/>
+          <w:color w:val="3A9FD6"/>
+          <w:sz w:val="16"/>
+        </w:rPr>
+        <w:t xml:space="preserve">[FIX] </w:t>
+      </w:r>
+      <w:r>
+        <w:rPr>
+          <w:sz w:val="18"/>
+        </w:rPr>
+        <w:t>Replace scale slider with numbered button grid, fix forced-choice text cutoff</w:t>
+      </w:r>
+    </w:p>
+    <w:p>
+      <w:pPr>
+        <w:pStyle w:val="ListBullet"/>
+      </w:pPr>
+      <w:r>
+        <w:rPr>
+          <w:b/>
+          <w:color w:val="3A9FD6"/>
+          <w:sz w:val="16"/>
+        </w:rPr>
+        <w:t xml:space="preserve">[FIX] </w:t>
+      </w:r>
+      <w:r>
+        <w:rPr>
+          <w:sz w:val="18"/>
+        </w:rPr>
+        <w:t>Prevent duplicate survey submissions across devices</w:t>
       </w:r>
     </w:p>
     <w:p>
@@ -1364,7 +2232,7 @@
           <w:color w:val="1B2A47"/>
           <w:sz w:val="22"/>
         </w:rPr>
-        <w:t>Coaching Module</w:t>
+        <w:t>Authentication &amp; Security</w:t>
       </w:r>
     </w:p>
     <w:p>
@@ -1377,13 +2245,260 @@
           <w:color w:val="3A9FD6"/>
           <w:sz w:val="16"/>
         </w:rPr>
+        <w:t xml:space="preserve">[FIX] </w:t>
+      </w:r>
+      <w:r>
+        <w:rPr>
+          <w:sz w:val="18"/>
+        </w:rPr>
+        <w:t>Trust proxy for rate limits + robust inactivity tracking</w:t>
+      </w:r>
+    </w:p>
+    <w:p>
+      <w:pPr>
+        <w:pStyle w:val="ListBullet"/>
+      </w:pPr>
+      <w:r>
+        <w:rPr>
+          <w:b/>
+          <w:color w:val="3A9FD6"/>
+          <w:sz w:val="16"/>
+        </w:rPr>
+        <w:t xml:space="preserve">[REFACTOR] </w:t>
+      </w:r>
+      <w:r>
+        <w:rPr>
+          <w:sz w:val="18"/>
+        </w:rPr>
+        <w:t>Migrate all routes from requireRole to requirePermission</w:t>
+      </w:r>
+    </w:p>
+    <w:p>
+      <w:pPr>
+        <w:pStyle w:val="ListBullet"/>
+      </w:pPr>
+      <w:r>
+        <w:rPr>
+          <w:b/>
+          <w:color w:val="3A9FD6"/>
+          <w:sz w:val="16"/>
+        </w:rPr>
         <w:t xml:space="preserve">[UI] </w:t>
       </w:r>
       <w:r>
         <w:rPr>
           <w:sz w:val="18"/>
         </w:rPr>
-        <w:t>Rename Employee role to Coachee; gate Sponsor to coachees</w:t>
+        <w:t>Split-screen login page with module showcase carousel</w:t>
+      </w:r>
+    </w:p>
+    <w:p>
+      <w:pPr>
+        <w:pStyle w:val="ListBullet"/>
+      </w:pPr>
+      <w:r>
+        <w:rPr>
+          <w:b/>
+          <w:color w:val="3A9FD6"/>
+          <w:sz w:val="16"/>
+        </w:rPr>
+        <w:t xml:space="preserve">[UI] </w:t>
+      </w:r>
+      <w:r>
+        <w:rPr>
+          <w:sz w:val="18"/>
+        </w:rPr>
+        <w:t>Rich login carousel with doc-sourced content, workflows, and stats</w:t>
+      </w:r>
+    </w:p>
+    <w:p>
+      <w:pPr>
+        <w:pStyle w:val="ListBullet"/>
+      </w:pPr>
+      <w:r>
+        <w:rPr>
+          <w:b/>
+          <w:color w:val="3A9FD6"/>
+          <w:sz w:val="16"/>
+        </w:rPr>
+        <w:t xml:space="preserve">[FIX] </w:t>
+      </w:r>
+      <w:r>
+        <w:rPr>
+          <w:sz w:val="18"/>
+        </w:rPr>
+        <w:t>Constrain info panel to viewport, center stats, fix dot styles</w:t>
+      </w:r>
+    </w:p>
+    <w:p>
+      <w:pPr>
+        <w:pStyle w:val="ListBullet"/>
+      </w:pPr>
+      <w:r>
+        <w:rPr>
+          <w:b/>
+          <w:color w:val="3A9FD6"/>
+          <w:sz w:val="16"/>
+        </w:rPr>
+        <w:t xml:space="preserve">[UI] </w:t>
+      </w:r>
+      <w:r>
+        <w:rPr>
+          <w:sz w:val="18"/>
+        </w:rPr>
+        <w:t>Mobile login - hide brand bar, compact card centered on gradient</w:t>
+      </w:r>
+    </w:p>
+    <w:p>
+      <w:pPr>
+        <w:pStyle w:val="ListBullet"/>
+      </w:pPr>
+      <w:r>
+        <w:rPr>
+          <w:b/>
+          <w:color w:val="3A9FD6"/>
+          <w:sz w:val="16"/>
+        </w:rPr>
+        <w:t xml:space="preserve">[UI] </w:t>
+      </w:r>
+      <w:r>
+        <w:rPr>
+          <w:sz w:val="18"/>
+        </w:rPr>
+        <w:t>Add hero images to login carousel slides</w:t>
+      </w:r>
+    </w:p>
+    <w:p>
+      <w:pPr>
+        <w:pStyle w:val="ListBullet"/>
+      </w:pPr>
+      <w:r>
+        <w:rPr>
+          <w:b/>
+          <w:color w:val="3A9FD6"/>
+          <w:sz w:val="16"/>
+        </w:rPr>
+        <w:t xml:space="preserve">[UI] </w:t>
+      </w:r>
+      <w:r>
+        <w:rPr>
+          <w:sz w:val="18"/>
+        </w:rPr>
+        <w:t>Add intake module hero image to login carousel</w:t>
+      </w:r>
+    </w:p>
+    <w:p>
+      <w:pPr>
+        <w:pStyle w:val="ListBullet"/>
+      </w:pPr>
+      <w:r>
+        <w:rPr>
+          <w:b/>
+          <w:color w:val="3A9FD6"/>
+          <w:sz w:val="16"/>
+        </w:rPr>
+        <w:t xml:space="preserve">[FIX] </w:t>
+      </w:r>
+      <w:r>
+        <w:rPr>
+          <w:sz w:val="18"/>
+        </w:rPr>
+        <w:t>Replace MSAL with direct HTTP for Microsoft token exchange/refresh</w:t>
+      </w:r>
+    </w:p>
+    <w:p>
+      <w:pPr>
+        <w:pStyle w:val="ListBullet"/>
+      </w:pPr>
+      <w:r>
+        <w:rPr>
+          <w:b/>
+          <w:color w:val="3A9FD6"/>
+          <w:sz w:val="16"/>
+        </w:rPr>
+        <w:t xml:space="preserve">[SECURITY] </w:t>
+      </w:r>
+      <w:r>
+        <w:rPr>
+          <w:sz w:val="18"/>
+        </w:rPr>
+        <w:t>Remove Azure client secrets from tracked file</w:t>
+      </w:r>
+    </w:p>
+    <w:p>
+      <w:pPr>
+        <w:pStyle w:val="ListBullet"/>
+      </w:pPr>
+      <w:r>
+        <w:rPr>
+          <w:b/>
+          <w:color w:val="3A9FD6"/>
+          <w:sz w:val="16"/>
+        </w:rPr>
+        <w:t xml:space="preserve">[FIX] </w:t>
+      </w:r>
+      <w:r>
+        <w:rPr>
+          <w:sz w:val="18"/>
+        </w:rPr>
+        <w:t>Run reCAPTCHA callbacks inside NgZone so router.navigate triggers</w:t>
+      </w:r>
+    </w:p>
+    <w:p>
+      <w:pPr>
+        <w:pStyle w:val="ListBullet"/>
+      </w:pPr>
+      <w:r>
+        <w:rPr>
+          <w:b/>
+          <w:color w:val="3A9FD6"/>
+          <w:sz w:val="16"/>
+        </w:rPr>
+        <w:t xml:space="preserve">[FIX] </w:t>
+      </w:r>
+      <w:r>
+        <w:rPr>
+          <w:sz w:val="18"/>
+        </w:rPr>
+        <w:t>Hide reCAPTCHA badge, add inline attribution on protected forms</w:t>
+      </w:r>
+    </w:p>
+    <w:p>
+      <w:pPr>
+        <w:pStyle w:val="ListBullet"/>
+      </w:pPr>
+      <w:r>
+        <w:rPr>
+          <w:b/>
+          <w:color w:val="3A9FD6"/>
+          <w:sz w:val="16"/>
+        </w:rPr>
+        <w:t xml:space="preserve">[FIX] </w:t>
+      </w:r>
+      <w:r>
+        <w:rPr>
+          <w:sz w:val="18"/>
+        </w:rPr>
+        <w:t>Strip iat/exp from decoded token before re-signing in refresh endpoint</w:t>
+      </w:r>
+    </w:p>
+    <w:p>
+      <w:pPr>
+        <w:pStyle w:val="ListBullet"/>
+      </w:pPr>
+      <w:r>
+        <w:rPr>
+          <w:b/>
+          <w:color w:val="3A9FD6"/>
+          <w:sz w:val="16"/>
+        </w:rPr>
+        <w:t xml:space="preserve">[NEW] </w:t>
+      </w:r>
+      <w:r>
+        <w:rPr>
+          <w:sz w:val="18"/>
+        </w:rPr>
+        <w:t>Active login sessions â€” view and revoke from profile + admin panel</w:t>
       </w:r>
     </w:p>
     <w:p>
@@ -1396,7 +2511,7 @@
           <w:color w:val="6B7C93"/>
           <w:sz w:val="16"/>
         </w:rPr>
-        <w:t>The 'coachee' role now displays as 'Coachee' across user management,</w:t>
+        <w:t>LoginSession model tracks device, IP, and last activity per login</w:t>
       </w:r>
     </w:p>
     <w:p>
@@ -1415,7 +2530,79 @@
         <w:rPr>
           <w:sz w:val="18"/>
         </w:rPr>
-        <w:t>Engagement dialog pulls from /users/coachees</w:t>
+        <w:t>Add page padding to admin login sessions page</w:t>
+      </w:r>
+    </w:p>
+    <w:p>
+      <w:pPr>
+        <w:pStyle w:val="ListBullet"/>
+      </w:pPr>
+      <w:r>
+        <w:rPr>
+          <w:b/>
+          <w:color w:val="3A9FD6"/>
+          <w:sz w:val="16"/>
+        </w:rPr>
+        <w:t xml:space="preserve">[FIX] </w:t>
+      </w:r>
+      <w:r>
+        <w:rPr>
+          <w:sz w:val="18"/>
+        </w:rPr>
+        <w:t>Logout cleans session, fix stale route ordering, admin refresh/clean buttons</w:t>
+      </w:r>
+    </w:p>
+    <w:p>
+      <w:pPr>
+        <w:pStyle w:val="ListBullet"/>
+      </w:pPr>
+      <w:r>
+        <w:rPr>
+          <w:b/>
+          <w:color w:val="3A9FD6"/>
+          <w:sz w:val="16"/>
+        </w:rPr>
+        <w:t xml:space="preserve">[FIX] </w:t>
+      </w:r>
+      <w:r>
+        <w:rPr>
+          <w:sz w:val="18"/>
+        </w:rPr>
+        <w:t>Deduplicate login sessions by userId+device+ip</w:t>
+      </w:r>
+    </w:p>
+    <w:p>
+      <w:pPr>
+        <w:pBdr>
+          <w:bottom w:val="single" w:sz="4" w:space="1" w:color="3A9FD6"/>
+        </w:pBdr>
+      </w:pPr>
+      <w:r>
+        <w:rPr>
+          <w:b/>
+          <w:color w:val="1B2A47"/>
+          <w:sz w:val="22"/>
+        </w:rPr>
+        <w:t>Message Hub &amp; Notifications</w:t>
+      </w:r>
+    </w:p>
+    <w:p>
+      <w:pPr>
+        <w:pStyle w:val="ListBullet"/>
+      </w:pPr>
+      <w:r>
+        <w:rPr>
+          <w:b/>
+          <w:color w:val="3A9FD6"/>
+          <w:sz w:val="16"/>
+        </w:rPr>
+        <w:t xml:space="preserve">[NEW] </w:t>
+      </w:r>
+      <w:r>
+        <w:rPr>
+          <w:sz w:val="18"/>
+        </w:rPr>
+        <w:t>Mirror all email communications into message hub notifications</w:t>
       </w:r>
     </w:p>
     <w:p>
@@ -1428,7 +2615,7 @@
           <w:color w:val="6B7C93"/>
           <w:sz w:val="16"/>
         </w:rPr>
-        <w:t>Coachee picker was calling /users (admin/HR-only, returned every user</w:t>
+        <w:t>Created hubNotification.service.ts with helpers for each communication</w:t>
       </w:r>
     </w:p>
     <w:p>
@@ -1441,13 +2628,51 @@
           <w:color w:val="3A9FD6"/>
           <w:sz w:val="16"/>
         </w:rPr>
+        <w:t xml:space="preserve">[FIX] </w:t>
+      </w:r>
+      <w:r>
+        <w:rPr>
+          <w:sz w:val="18"/>
+        </w:rPr>
+        <w:t>Filter out conversations with deleted/missing partner users</w:t>
+      </w:r>
+    </w:p>
+    <w:p>
+      <w:pPr>
+        <w:pStyle w:val="ListBullet"/>
+      </w:pPr>
+      <w:r>
+        <w:rPr>
+          <w:b/>
+          <w:color w:val="3A9FD6"/>
+          <w:sz w:val="16"/>
+        </w:rPr>
+        <w:t xml:space="preserve">[FIX] </w:t>
+      </w:r>
+      <w:r>
+        <w:rPr>
+          <w:sz w:val="18"/>
+        </w:rPr>
+        <w:t>Auto-mark orphaned messages as read to fix badge count</w:t>
+      </w:r>
+    </w:p>
+    <w:p>
+      <w:pPr>
+        <w:pStyle w:val="ListBullet"/>
+      </w:pPr>
+      <w:r>
+        <w:rPr>
+          <w:b/>
+          <w:color w:val="3A9FD6"/>
+          <w:sz w:val="16"/>
+        </w:rPr>
         <w:t xml:space="preserve">[NEW] </w:t>
       </w:r>
       <w:r>
         <w:rPr>
           <w:sz w:val="18"/>
         </w:rPr>
-        <w:t>Sponsor column in user management list</w:t>
+        <w:t>Granular notification preferences per user</w:t>
       </w:r>
     </w:p>
     <w:p>
@@ -1460,7 +2685,7 @@
           <w:color w:val="6B7C93"/>
           <w:sz w:val="16"/>
         </w:rPr>
-        <w:t>Populates sponsorId on GET /api/users ({name, email}) and renders the</w:t>
+        <w:t>Added notificationPreferences to User model with 8 categories:</w:t>
       </w:r>
     </w:p>
     <w:p>
@@ -1473,13 +2698,13 @@
           <w:color w:val="3A9FD6"/>
           <w:sz w:val="16"/>
         </w:rPr>
-        <w:t xml:space="preserve">[UI] </w:t>
+        <w:t xml:space="preserve">[NEW] </w:t>
       </w:r>
       <w:r>
         <w:rPr>
           <w:sz w:val="18"/>
         </w:rPr>
-        <w:t>Sponsor column shows "company / name"; sponsors + tile</w:t>
+        <w:t>Reorder tabs, auto-select unread tab, auto-open on login</w:t>
       </w:r>
     </w:p>
     <w:p>
@@ -1492,7 +2717,7 @@
           <w:color w:val="6B7C93"/>
           <w:sz w:val="16"/>
         </w:rPr>
-        <w:t>User-management Sponsor column renders "{sponsor.organization} /</w:t>
+        <w:t>Notifications tab first, messages second</w:t>
       </w:r>
     </w:p>
     <w:p>
@@ -1511,7 +2736,60 @@
         <w:rPr>
           <w:sz w:val="18"/>
         </w:rPr>
-        <w:t>Coaching module + pre-session intake attached to sessions</w:t>
+        <w:t>Add mark as read/unread toggle for messages and notifications</w:t>
+      </w:r>
+    </w:p>
+    <w:p>
+      <w:pPr>
+        <w:pStyle w:val="ListBullet"/>
+      </w:pPr>
+      <w:r>
+        <w:rPr>
+          <w:b/>
+          <w:color w:val="3A9FD6"/>
+          <w:sz w:val="16"/>
+        </w:rPr>
+        <w:t xml:space="preserve">[CI] </w:t>
+      </w:r>
+      <w:r>
+        <w:rPr>
+          <w:sz w:val="18"/>
+        </w:rPr>
+        <w:t>Add weekly changelog GitHub Actions workflow (Tuesdays 09:00 UTC)</w:t>
+      </w:r>
+    </w:p>
+    <w:p>
+      <w:pPr>
+        <w:pBdr>
+          <w:bottom w:val="single" w:sz="4" w:space="1" w:color="3A9FD6"/>
+        </w:pBdr>
+      </w:pPr>
+      <w:r>
+        <w:rPr>
+          <w:b/>
+          <w:color w:val="1B2A47"/>
+          <w:sz w:val="22"/>
+        </w:rPr>
+        <w:t>Document Generation &amp; Billing</w:t>
+      </w:r>
+    </w:p>
+    <w:p>
+      <w:pPr>
+        <w:pStyle w:val="ListBullet"/>
+      </w:pPr>
+      <w:r>
+        <w:rPr>
+          <w:b/>
+          <w:color w:val="3A9FD6"/>
+          <w:sz w:val="16"/>
+        </w:rPr>
+        <w:t xml:space="preserve">[NEW] </w:t>
+      </w:r>
+      <w:r>
+        <w:rPr>
+          <w:sz w:val="18"/>
+        </w:rPr>
+        <w:t>Generate toolkit PDFs and upload to S3, wire download buttons</w:t>
       </w:r>
     </w:p>
     <w:p>
@@ -1524,7 +2802,7 @@
           <w:color w:val="6B7C93"/>
           <w:sz w:val="16"/>
         </w:rPr>
-        <w:t>Add 'coaching' to the SurveyTemplate moduleType enum so intake templates</w:t>
+        <w:t>Create 7 Interest-Based Negotiation Toolkit worksheets as PDFs using</w:t>
       </w:r>
     </w:p>
     <w:p>
@@ -1537,13 +2815,13 @@
           <w:color w:val="3A9FD6"/>
           <w:sz w:val="16"/>
         </w:rPr>
-        <w:t xml:space="preserve">[NEW] </w:t>
+        <w:t xml:space="preserve">[FIX] </w:t>
       </w:r>
       <w:r>
         <w:rPr>
           <w:sz w:val="18"/>
         </w:rPr>
-        <w:t>IsCoachee on user dialogs + list; robust org-chart save</w:t>
+        <w:t>Rewrite toolkit PDFs â€” tight layout, inline content disposition</w:t>
       </w:r>
     </w:p>
     <w:p>
@@ -1556,13 +2834,85 @@
           <w:color w:val="3A9FD6"/>
           <w:sz w:val="16"/>
         </w:rPr>
+        <w:t xml:space="preserve">[CHORE] </w:t>
+      </w:r>
+      <w:r>
+        <w:rPr>
+          <w:sz w:val="18"/>
+        </w:rPr>
+        <w:t>Add generate_changelog.py script for weekly .docx reports</w:t>
+      </w:r>
+    </w:p>
+    <w:p>
+      <w:pPr>
+        <w:pStyle w:val="ListBullet"/>
+      </w:pPr>
+      <w:r>
+        <w:rPr>
+          <w:b/>
+          <w:color w:val="3A9FD6"/>
+          <w:sz w:val="16"/>
+        </w:rPr>
         <w:t xml:space="preserve">[NEW] </w:t>
       </w:r>
       <w:r>
         <w:rPr>
           <w:sz w:val="18"/>
         </w:rPr>
-        <w:t>Status filter pills on engagement sessions list</w:t>
+        <w:t>PDF invoice attachments, company address, split taxes, DX fixes</w:t>
+      </w:r>
+    </w:p>
+    <w:p>
+      <w:pPr>
+        <w:pBdr>
+          <w:bottom w:val="single" w:sz="4" w:space="1" w:color="3A9FD6"/>
+        </w:pBdr>
+      </w:pPr>
+      <w:r>
+        <w:rPr>
+          <w:b/>
+          <w:color w:val="1B2A47"/>
+          <w:sz w:val="22"/>
+        </w:rPr>
+        <w:t>UI / UX Improvements</w:t>
+      </w:r>
+    </w:p>
+    <w:p>
+      <w:pPr>
+        <w:pStyle w:val="ListBullet"/>
+      </w:pPr>
+      <w:r>
+        <w:rPr>
+          <w:b/>
+          <w:color w:val="3A9FD6"/>
+          <w:sz w:val="16"/>
+        </w:rPr>
+        <w:t xml:space="preserve">[FIX] </w:t>
+      </w:r>
+      <w:r>
+        <w:rPr>
+          <w:sz w:val="18"/>
+        </w:rPr>
+        <w:t>Globally center mat-icon-button icons across all components</w:t>
+      </w:r>
+    </w:p>
+    <w:p>
+      <w:pPr>
+        <w:pStyle w:val="ListBullet"/>
+      </w:pPr>
+      <w:r>
+        <w:rPr>
+          <w:b/>
+          <w:color w:val="3A9FD6"/>
+          <w:sz w:val="16"/>
+        </w:rPr>
+        <w:t xml:space="preserve">[NEW] </w:t>
+      </w:r>
+      <w:r>
+        <w:rPr>
+          <w:sz w:val="18"/>
+        </w:rPr>
+        <w:t>Legal pages, cookie consent, app footer, carousel animation</w:t>
       </w:r>
     </w:p>
     <w:p>
@@ -1575,7 +2925,7 @@
           <w:color w:val="6B7C93"/>
           <w:sz w:val="16"/>
         </w:rPr>
-        <w:t>Pills above the sessions timeline â€” Scheduled / Completed / Cancelled /</w:t>
+        <w:t>Public pages at /termsofservice, /privacystatement, /eula covering</w:t>
       </w:r>
     </w:p>
     <w:p>
@@ -1594,7 +2944,7 @@
         <w:rPr>
           <w:sz w:val="18"/>
         </w:rPr>
-        <w:t>Sponsor column in coachees list</w:t>
+        <w:t>Functional org theme system â€” apply on save, logo, CSS var audit</w:t>
       </w:r>
     </w:p>
     <w:p>
@@ -1607,7 +2957,7 @@
           <w:color w:val="6B7C93"/>
           <w:sz w:val="16"/>
         </w:rPr>
-        <w:t>Populate sponsorId on GET /api/users/coachees (name, email,</w:t>
+        <w:t>Theme now applies immediately after saving in org settings (was missing</w:t>
       </w:r>
     </w:p>
     <w:p>
@@ -1620,13 +2970,66 @@
           <w:color w:val="3A9FD6"/>
           <w:sz w:val="16"/>
         </w:rPr>
+        <w:t xml:space="preserve">[FIX] </w:t>
+      </w:r>
+      <w:r>
+        <w:rPr>
+          <w:sz w:val="18"/>
+        </w:rPr>
+        <w:t>Org logo in sidebar switcher, carousel pause button + hover pause</w:t>
+      </w:r>
+    </w:p>
+    <w:p>
+      <w:pPr>
+        <w:pBdr>
+          <w:bottom w:val="single" w:sz="4" w:space="1" w:color="3A9FD6"/>
+        </w:pBdr>
+      </w:pPr>
+      <w:r>
+        <w:rPr>
+          <w:b/>
+          <w:color w:val="1B2A47"/>
+          <w:sz w:val="22"/>
+        </w:rPr>
+        <w:t>Admin &amp; User Management</w:t>
+      </w:r>
+    </w:p>
+    <w:p>
+      <w:pPr>
+        <w:pStyle w:val="ListBullet"/>
+      </w:pPr>
+      <w:r>
+        <w:rPr>
+          <w:b/>
+          <w:color w:val="3A9FD6"/>
+          <w:sz w:val="16"/>
+        </w:rPr>
+        <w:t xml:space="preserve">[UI] </w:t>
+      </w:r>
+      <w:r>
+        <w:rPr>
+          <w:sz w:val="18"/>
+        </w:rPr>
+        <w:t>Rename Employee role to Coachee; gate Sponsor to coachees</w:t>
+      </w:r>
+    </w:p>
+    <w:p>
+      <w:pPr>
+        <w:pStyle w:val="ListBullet"/>
+      </w:pPr>
+      <w:r>
+        <w:rPr>
+          <w:b/>
+          <w:color w:val="3A9FD6"/>
+          <w:sz w:val="16"/>
+        </w:rPr>
         <w:t xml:space="preserve">[NEW] </w:t>
       </w:r>
       <w:r>
         <w:rPr>
           <w:sz w:val="18"/>
         </w:rPr>
-        <w:t>View pre-session intake results from the session card</w:t>
+        <w:t>Sponsor column in user management list</w:t>
       </w:r>
     </w:p>
     <w:p>
@@ -1639,7 +3042,7 @@
           <w:color w:val="6B7C93"/>
           <w:sz w:val="16"/>
         </w:rPr>
-        <w:t>Completed pre-session intake cards now show a "View results" button for</w:t>
+        <w:t>Populates sponsorId on GET /api/users ({name, email}) and renders the</w:t>
       </w:r>
     </w:p>
     <w:p>
@@ -1658,7 +3061,117 @@
         <w:rPr>
           <w:sz w:val="18"/>
         </w:rPr>
+        <w:t>IsCoachee flag so any user can also be a coachee</w:t>
+      </w:r>
+    </w:p>
+    <w:p>
+      <w:pPr>
+        <w:pStyle w:val="ListBullet"/>
+      </w:pPr>
+      <w:r>
+        <w:rPr>
+          <w:b/>
+          <w:color w:val="3A9FD6"/>
+          <w:sz w:val="16"/>
+        </w:rPr>
+        <w:t xml:space="preserve">[NEW] </w:t>
+      </w:r>
+      <w:r>
+        <w:rPr>
+          <w:sz w:val="18"/>
+        </w:rPr>
+        <w:t>IsCoachee on user dialogs + list; robust org-chart save</w:t>
+      </w:r>
+    </w:p>
+    <w:p>
+      <w:pPr>
+        <w:pStyle w:val="ListBullet"/>
+      </w:pPr>
+      <w:r>
+        <w:rPr>
+          <w:b/>
+          <w:color w:val="3A9FD6"/>
+          <w:sz w:val="16"/>
+        </w:rPr>
+        <w:t xml:space="preserve">[REFACTOR] </w:t>
+      </w:r>
+      <w:r>
+        <w:rPr>
+          <w:sz w:val="18"/>
+        </w:rPr>
         <w:t>Nest coaching sub-settings inside the coaching module row</w:t>
+      </w:r>
+    </w:p>
+    <w:p>
+      <w:pPr>
+        <w:pStyle w:val="ListBullet"/>
+      </w:pPr>
+      <w:r>
+        <w:rPr>
+          <w:b/>
+          <w:color w:val="3A9FD6"/>
+          <w:sz w:val="16"/>
+        </w:rPr>
+        <w:t xml:space="preserve">[FIX] </w:t>
+      </w:r>
+      <w:r>
+        <w:rPr>
+          <w:sz w:val="18"/>
+        </w:rPr>
+        <w:t>Hide revoke button for own session, add 'You' badge in admin sessions</w:t>
+      </w:r>
+    </w:p>
+    <w:p>
+      <w:pPr>
+        <w:pBdr>
+          <w:bottom w:val="single" w:sz="4" w:space="1" w:color="3A9FD6"/>
+        </w:pBdr>
+      </w:pPr>
+      <w:r>
+        <w:rPr>
+          <w:b/>
+          <w:color w:val="1B2A47"/>
+          <w:sz w:val="22"/>
+        </w:rPr>
+        <w:t>Infrastructure &amp; CI/CD</w:t>
+      </w:r>
+    </w:p>
+    <w:p>
+      <w:pPr>
+        <w:pStyle w:val="ListBullet"/>
+      </w:pPr>
+      <w:r>
+        <w:rPr>
+          <w:b/>
+          <w:color w:val="3A9FD6"/>
+          <w:sz w:val="16"/>
+        </w:rPr>
+        <w:t xml:space="preserve">[CHORE] </w:t>
+      </w:r>
+      <w:r>
+        <w:rPr>
+          <w:sz w:val="18"/>
+        </w:rPr>
+        <w:t>Bump initial bundle budget warning to 650kb</w:t>
+      </w:r>
+    </w:p>
+    <w:p>
+      <w:pPr>
+        <w:pStyle w:val="ListBullet"/>
+      </w:pPr>
+      <w:r>
+        <w:rPr>
+          <w:b/>
+          <w:color w:val="3A9FD6"/>
+          <w:sz w:val="16"/>
+        </w:rPr>
+        <w:t xml:space="preserve">[NEW] </w:t>
+      </w:r>
+      <w:r>
+        <w:rPr>
+          <w:sz w:val="18"/>
+        </w:rPr>
+        <w:t>Implementation status doc + complete skill building section (ch.7)</w:t>
       </w:r>
     </w:p>
     <w:p>
@@ -1671,7 +3184,7 @@
           <w:color w:val="6B7C93"/>
           <w:sz w:val="16"/>
         </w:rPr>
-        <w:t>Rebill Coachees + Coachees-can-choose-their-own-coach were rendered as</w:t>
+        <w:t>Add conflict_intelligence_implementation_status.md with 23 completed items</w:t>
       </w:r>
     </w:p>
     <w:p>
@@ -1690,20 +3203,7 @@
         <w:rPr>
           <w:sz w:val="18"/>
         </w:rPr>
-        <w:t>Scope the coachee journal to a single session when opened from a session card</w:t>
-      </w:r>
-    </w:p>
-    <w:p>
-      <w:pPr>
-        <w:ind w:left="720"/>
-      </w:pPr>
-      <w:r>
-        <w:rPr>
-          <w:i/>
-          <w:color w:val="6B7C93"/>
-          <w:sz w:val="16"/>
-        </w:rPr>
-        <w:t>The 'Open journal' / 'Open my journal' buttons on each session row now</w:t>
+        <w:t>Install CocoaPods before cap sync ios</w:t>
       </w:r>
     </w:p>
     <w:p>
@@ -1716,26 +3216,13 @@
           <w:color w:val="3A9FD6"/>
           <w:sz w:val="16"/>
         </w:rPr>
-        <w:t xml:space="preserve">[NEW] </w:t>
+        <w:t xml:space="preserve">[FIX] </w:t>
       </w:r>
       <w:r>
         <w:rPr>
           <w:sz w:val="18"/>
         </w:rPr>
-        <w:t>Conflict analysis detail page + pre/post session coaching forms</w:t>
-      </w:r>
-    </w:p>
-    <w:p>
-      <w:pPr>
-        <w:ind w:left="720"/>
-      </w:pPr>
-      <w:r>
-        <w:rPr>
-          <w:i/>
-          <w:color w:val="6B7C93"/>
-          <w:sz w:val="16"/>
-        </w:rPr>
-        <w:t>Conflict: rename surveyPeriodâ†’name, templateIdâ†’intakeTemplateId (populated)</w:t>
+        <w:t>Use Node 22 for iOS build â€” Capacitor 8 requires &gt;=22</w:t>
       </w:r>
     </w:p>
     <w:p>
@@ -1748,26 +3235,28 @@
           <w:color w:val="3A9FD6"/>
           <w:sz w:val="16"/>
         </w:rPr>
-        <w:t xml:space="preserve">[UI] </w:t>
+        <w:t xml:space="preserve">[CHORE] </w:t>
       </w:r>
       <w:r>
         <w:rPr>
           <w:sz w:val="18"/>
         </w:rPr>
-        <w:t>Split-screen login page with module showcase carousel</w:t>
+        <w:t>Weekly changelog 2026-04-21</w:t>
       </w:r>
     </w:p>
     <w:p>
       <w:pPr>
-        <w:ind w:left="720"/>
-      </w:pPr>
-      <w:r>
-        <w:rPr>
-          <w:i/>
-          <w:color w:val="6B7C93"/>
-          <w:sz w:val="16"/>
-        </w:rPr>
-        <w:t>Left panel shows ARTES branding, tagline, and auto-rotating module</w:t>
+        <w:pBdr>
+          <w:bottom w:val="single" w:sz="4" w:space="1" w:color="3A9FD6"/>
+        </w:pBdr>
+      </w:pPr>
+      <w:r>
+        <w:rPr>
+          <w:b/>
+          <w:color w:val="1B2A47"/>
+          <w:sz w:val="22"/>
+        </w:rPr>
+        <w:t>Documentation &amp; Chores</w:t>
       </w:r>
     </w:p>
     <w:p>
@@ -1780,2127 +3269,13 @@
           <w:color w:val="3A9FD6"/>
           <w:sz w:val="16"/>
         </w:rPr>
-        <w:t xml:space="preserve">[NEW] </w:t>
+        <w:t xml:space="preserve">[CHORE] </w:t>
       </w:r>
       <w:r>
         <w:rPr>
           <w:sz w:val="18"/>
         </w:rPr>
-        <w:t>Fix coachees, dashboard cards, sponsors, interview, intakes</w:t>
-      </w:r>
-    </w:p>
-    <w:p>
-      <w:pPr>
-        <w:ind w:left="720"/>
-      </w:pPr>
-      <w:r>
-        <w:rPr>
-          <w:i/>
-          <w:color w:val="6B7C93"/>
-          <w:sz w:val="16"/>
-        </w:rPr>
-        <w:t>Translates coachees filter pills + table headers, dashboard module cards</w:t>
-      </w:r>
-    </w:p>
-    <w:p>
-      <w:pPr>
-        <w:pStyle w:val="ListBullet"/>
-      </w:pPr>
-      <w:r>
-        <w:rPr>
-          <w:b/>
-          <w:color w:val="3A9FD6"/>
-          <w:sz w:val="16"/>
-        </w:rPr>
-        <w:t xml:space="preserve">[NEW] </w:t>
-      </w:r>
-      <w:r>
-        <w:rPr>
-          <w:sz w:val="18"/>
-        </w:rPr>
-        <w:t>Conflict skill pages, coachee journal, Phase 6</w:t>
-      </w:r>
-    </w:p>
-    <w:p>
-      <w:pPr>
-        <w:ind w:left="720"/>
-      </w:pPr>
-      <w:r>
-        <w:rPr>
-          <w:i/>
-          <w:color w:val="6B7C93"/>
-          <w:sz w:val="16"/>
-        </w:rPr>
-        <w:t>Translates conflict-skill-building (frameworks, tools, resources),</w:t>
-      </w:r>
-    </w:p>
-    <w:p>
-      <w:pPr>
-        <w:pStyle w:val="ListBullet"/>
-      </w:pPr>
-      <w:r>
-        <w:rPr>
-          <w:b/>
-          <w:color w:val="3A9FD6"/>
-          <w:sz w:val="16"/>
-        </w:rPr>
-        <w:t xml:space="preserve">[NEW] </w:t>
-      </w:r>
-      <w:r>
-        <w:rPr>
-          <w:sz w:val="18"/>
-        </w:rPr>
-        <w:t>SVG flag picker, engagement-detail fixes, login flags</w:t>
-      </w:r>
-    </w:p>
-    <w:p>
-      <w:pPr>
-        <w:ind w:left="720"/>
-      </w:pPr>
-      <w:r>
-        <w:rPr>
-          <w:i/>
-          <w:color w:val="6B7C93"/>
-          <w:sz w:val="16"/>
-        </w:rPr>
-        <w:t>Replaces emoji flags with inline SVG country flags (Windows compat).</w:t>
-      </w:r>
-    </w:p>
-    <w:p>
-      <w:pPr>
-        <w:pStyle w:val="ListBullet"/>
-      </w:pPr>
-      <w:r>
-        <w:rPr>
-          <w:b/>
-          <w:color w:val="3A9FD6"/>
-          <w:sz w:val="16"/>
-        </w:rPr>
-        <w:t xml:space="preserve">[NEW] </w:t>
-      </w:r>
-      <w:r>
-        <w:rPr>
-          <w:sz w:val="18"/>
-        </w:rPr>
-        <w:t>Legal pages full translation, intake dialog, deep sweep</w:t>
-      </w:r>
-    </w:p>
-    <w:p>
-      <w:pPr>
-        <w:ind w:left="720"/>
-      </w:pPr>
-      <w:r>
-        <w:rPr>
-          <w:i/>
-          <w:color w:val="6B7C93"/>
-          <w:sz w:val="16"/>
-        </w:rPr>
-        <w:t>Translates all three legal pages (Terms, Privacy, EULA) body text to</w:t>
-      </w:r>
-    </w:p>
-    <w:p>
-      <w:pPr>
-        <w:pStyle w:val="ListBullet"/>
-      </w:pPr>
-      <w:r>
-        <w:rPr>
-          <w:b/>
-          <w:color w:val="3A9FD6"/>
-          <w:sz w:val="16"/>
-        </w:rPr>
-        <w:t xml:space="preserve">[FIX] </w:t>
-      </w:r>
-      <w:r>
-        <w:rPr>
-          <w:sz w:val="18"/>
-        </w:rPr>
-        <w:t>Add missing translation keys for sponsor billing, org chart, and billing</w:t>
-      </w:r>
-    </w:p>
-    <w:p>
-      <w:pPr>
-        <w:pStyle w:val="ListBullet"/>
-      </w:pPr>
-      <w:r>
-        <w:rPr>
-          <w:b/>
-          <w:color w:val="3A9FD6"/>
-          <w:sz w:val="16"/>
-        </w:rPr>
-        <w:t xml:space="preserve">[FIX] </w:t>
-      </w:r>
-      <w:r>
-        <w:rPr>
-          <w:sz w:val="18"/>
-        </w:rPr>
-        <w:t>Coachee journal 403, pre-session notification, note previews, i18n</w:t>
-      </w:r>
-    </w:p>
-    <w:p>
-      <w:pPr>
-        <w:ind w:left="720"/>
-      </w:pPr>
-      <w:r>
-        <w:rPr>
-          <w:i/>
-          <w:color w:val="6B7C93"/>
-          <w:sz w:val="16"/>
-        </w:rPr>
-        <w:t>Let coachee role bypass VIEW_JOURNAL permission check in journal routes</w:t>
-      </w:r>
-    </w:p>
-    <w:p>
-      <w:pPr>
-        <w:pStyle w:val="ListBullet"/>
-      </w:pPr>
-      <w:r>
-        <w:rPr>
-          <w:b/>
-          <w:color w:val="3A9FD6"/>
-          <w:sz w:val="16"/>
-        </w:rPr>
-        <w:t xml:space="preserve">[NEW] </w:t>
-      </w:r>
-      <w:r>
-        <w:rPr>
-          <w:sz w:val="18"/>
-        </w:rPr>
-        <w:t>PDF invoice attachments, company address, split taxes, DX fixes</w:t>
-      </w:r>
-    </w:p>
-    <w:p>
-      <w:pPr>
-        <w:pBdr>
-          <w:bottom w:val="single" w:sz="4" w:space="1" w:color="3A9FD6"/>
-        </w:pBdr>
-      </w:pPr>
-      <w:r>
-        <w:rPr>
-          <w:b/>
-          <w:color w:val="1B2A47"/>
-          <w:sz w:val="22"/>
-        </w:rPr>
-        <w:t>Conflict Intelligence</w:t>
-      </w:r>
-    </w:p>
-    <w:p>
-      <w:pPr>
-        <w:pStyle w:val="ListBullet"/>
-      </w:pPr>
-      <w:r>
-        <w:rPr>
-          <w:b/>
-          <w:color w:val="3A9FD6"/>
-          <w:sz w:val="16"/>
-        </w:rPr>
-        <w:t xml:space="preserve">[NEW] </w:t>
-      </w:r>
-      <w:r>
-        <w:rPr>
-          <w:sz w:val="18"/>
-        </w:rPr>
-        <w:t>Per-template minResponsesForAnalysis gate</w:t>
-      </w:r>
-    </w:p>
-    <w:p>
-      <w:pPr>
-        <w:ind w:left="720"/>
-      </w:pPr>
-      <w:r>
-        <w:rPr>
-          <w:i/>
-          <w:color w:val="6B7C93"/>
-          <w:sz w:val="16"/>
-        </w:rPr>
-        <w:t>Intake templates gain a minResponsesForAnalysis field that controls</w:t>
-      </w:r>
-    </w:p>
-    <w:p>
-      <w:pPr>
-        <w:pStyle w:val="ListBullet"/>
-      </w:pPr>
-      <w:r>
-        <w:rPr>
-          <w:b/>
-          <w:color w:val="3A9FD6"/>
-          <w:sz w:val="16"/>
-        </w:rPr>
-        <w:t xml:space="preserve">[UI] </w:t>
-      </w:r>
-      <w:r>
-        <w:rPr>
-          <w:sz w:val="18"/>
-        </w:rPr>
-        <w:t>Make analysis cards clickable, remove View Details button</w:t>
-      </w:r>
-    </w:p>
-    <w:p>
-      <w:pPr>
-        <w:pStyle w:val="ListBullet"/>
-      </w:pPr>
-      <w:r>
-        <w:rPr>
-          <w:b/>
-          <w:color w:val="3A9FD6"/>
-          <w:sz w:val="16"/>
-        </w:rPr>
-        <w:t xml:space="preserve">[FIX] </w:t>
-      </w:r>
-      <w:r>
-        <w:rPr>
-          <w:sz w:val="18"/>
-        </w:rPr>
-        <w:t>Persist AI recommended actions to database</w:t>
-      </w:r>
-    </w:p>
-    <w:p>
-      <w:pPr>
-        <w:ind w:left="720"/>
-      </w:pPr>
-      <w:r>
-        <w:rPr>
-          <w:i/>
-          <w:color w:val="6B7C93"/>
-          <w:sz w:val="16"/>
-        </w:rPr>
-        <w:t>The controller generated actions but only returned them without saving.</w:t>
-      </w:r>
-    </w:p>
-    <w:p>
-      <w:pPr>
-        <w:pStyle w:val="ListBullet"/>
-      </w:pPr>
-      <w:r>
-        <w:rPr>
-          <w:b/>
-          <w:color w:val="3A9FD6"/>
-          <w:sz w:val="16"/>
-        </w:rPr>
-        <w:t xml:space="preserve">[UI] </w:t>
-      </w:r>
-      <w:r>
-        <w:rPr>
-          <w:sz w:val="18"/>
-        </w:rPr>
-        <w:t>Accordion layout for recommended actions with completion checkboxes</w:t>
-      </w:r>
-    </w:p>
-    <w:p>
-      <w:pPr>
-        <w:ind w:left="720"/>
-      </w:pPr>
-      <w:r>
-        <w:rPr>
-          <w:i/>
-          <w:color w:val="6B7C93"/>
-          <w:sz w:val="16"/>
-        </w:rPr>
-        <w:t>Immediate/short-term/long-term actions now use mat-accordion with</w:t>
-      </w:r>
-    </w:p>
-    <w:p>
-      <w:pPr>
-        <w:pStyle w:val="ListBullet"/>
-      </w:pPr>
-      <w:r>
-        <w:rPr>
-          <w:b/>
-          <w:color w:val="3A9FD6"/>
-          <w:sz w:val="16"/>
-        </w:rPr>
-        <w:t xml:space="preserve">[FIX] </w:t>
-      </w:r>
-      <w:r>
-        <w:rPr>
-          <w:sz w:val="18"/>
-        </w:rPr>
-        <w:t>Persist action completion checkboxes to database</w:t>
-      </w:r>
-    </w:p>
-    <w:p>
-      <w:pPr>
-        <w:ind w:left="720"/>
-      </w:pPr>
-      <w:r>
-        <w:rPr>
-          <w:i/>
-          <w:color w:val="6B7C93"/>
-          <w:sz w:val="16"/>
-        </w:rPr>
-        <w:t>Added completedActions field to ConflictAnalysis model, PATCH endpoint</w:t>
-      </w:r>
-    </w:p>
-    <w:p>
-      <w:pPr>
-        <w:pStyle w:val="ListBullet"/>
-      </w:pPr>
-      <w:r>
-        <w:rPr>
-          <w:b/>
-          <w:color w:val="3A9FD6"/>
-          <w:sz w:val="16"/>
-        </w:rPr>
-        <w:t xml:space="preserve">[UI] </w:t>
-      </w:r>
-      <w:r>
-        <w:rPr>
-          <w:sz w:val="18"/>
-        </w:rPr>
-        <w:t>Paragraph formatting for narratives + collapsible sub-analyses</w:t>
-      </w:r>
-    </w:p>
-    <w:p>
-      <w:pPr>
-        <w:ind w:left="720"/>
-      </w:pPr>
-      <w:r>
-        <w:rPr>
-          <w:i/>
-          <w:color w:val="6B7C93"/>
-          <w:sz w:val="16"/>
-        </w:rPr>
-        <w:t>Main AI narrative and sub-analysis narratives now split on double</w:t>
-      </w:r>
-    </w:p>
-    <w:p>
-      <w:pPr>
-        <w:pStyle w:val="ListBullet"/>
-      </w:pPr>
-      <w:r>
-        <w:rPr>
-          <w:b/>
-          <w:color w:val="3A9FD6"/>
-          <w:sz w:val="16"/>
-        </w:rPr>
-        <w:t xml:space="preserve">[REFACTOR] </w:t>
-      </w:r>
-      <w:r>
-        <w:rPr>
-          <w:sz w:val="18"/>
-        </w:rPr>
-        <w:t>Shared components + intake link + gauge sizing + budget + warnings</w:t>
-      </w:r>
-    </w:p>
-    <w:p>
-      <w:pPr>
-        <w:ind w:left="720"/>
-      </w:pPr>
-      <w:r>
-        <w:rPr>
-          <w:i/>
-          <w:color w:val="6B7C93"/>
-          <w:sz w:val="16"/>
-        </w:rPr>
-        <w:t>Shared components (6 new):</w:t>
-      </w:r>
-    </w:p>
-    <w:p>
-      <w:pPr>
-        <w:pStyle w:val="ListBullet"/>
-      </w:pPr>
-      <w:r>
-        <w:rPr>
-          <w:b/>
-          <w:color w:val="3A9FD6"/>
-          <w:sz w:val="16"/>
-        </w:rPr>
-        <w:t xml:space="preserve">[NEW] </w:t>
-      </w:r>
-      <w:r>
-        <w:rPr>
-          <w:sz w:val="18"/>
-        </w:rPr>
-        <w:t>AI usage limits, professional review workflow, action intake generation</w:t>
-      </w:r>
-    </w:p>
-    <w:p>
-      <w:pPr>
-        <w:ind w:left="720"/>
-      </w:pPr>
-      <w:r>
-        <w:rPr>
-          <w:i/>
-          <w:color w:val="6B7C93"/>
-          <w:sz w:val="16"/>
-        </w:rPr>
-        <w:t>Add per-org monthly AI generation tracking with plan-based limits (402 when exceeded),</w:t>
-      </w:r>
-    </w:p>
-    <w:p>
-      <w:pPr>
-        <w:pStyle w:val="ListBullet"/>
-      </w:pPr>
-      <w:r>
-        <w:rPr>
-          <w:b/>
-          <w:color w:val="3A9FD6"/>
-          <w:sz w:val="16"/>
-        </w:rPr>
-        <w:t xml:space="preserve">[NEW] </w:t>
-      </w:r>
-      <w:r>
-        <w:rPr>
-          <w:sz w:val="18"/>
-        </w:rPr>
-        <w:t>Custom AI analysis prompt per intake instrument</w:t>
-      </w:r>
-    </w:p>
-    <w:p>
-      <w:pPr>
-        <w:ind w:left="720"/>
-      </w:pPr>
-      <w:r>
-        <w:rPr>
-          <w:i/>
-          <w:color w:val="6B7C93"/>
-          <w:sz w:val="16"/>
-        </w:rPr>
-        <w:t>Add analysisPrompt field to SurveyTemplate â€” used as the system prompt</w:t>
-      </w:r>
-    </w:p>
-    <w:p>
-      <w:pPr>
-        <w:pStyle w:val="ListBullet"/>
-      </w:pPr>
-      <w:r>
-        <w:rPr>
-          <w:b/>
-          <w:color w:val="3A9FD6"/>
-          <w:sz w:val="16"/>
-        </w:rPr>
-        <w:t xml:space="preserve">[NEW] </w:t>
-      </w:r>
-      <w:r>
-        <w:rPr>
-          <w:sz w:val="18"/>
-        </w:rPr>
-        <w:t>Implementation status doc + complete skill building section (ch.7)</w:t>
-      </w:r>
-    </w:p>
-    <w:p>
-      <w:pPr>
-        <w:ind w:left="720"/>
-      </w:pPr>
-      <w:r>
-        <w:rPr>
-          <w:i/>
-          <w:color w:val="6B7C93"/>
-          <w:sz w:val="16"/>
-        </w:rPr>
-        <w:t>Add conflict_intelligence_implementation_status.md with 23 completed items</w:t>
-      </w:r>
-    </w:p>
-    <w:p>
-      <w:pPr>
-        <w:pStyle w:val="ListBullet"/>
-      </w:pPr>
-      <w:r>
-        <w:rPr>
-          <w:b/>
-          <w:color w:val="3A9FD6"/>
-          <w:sz w:val="16"/>
-        </w:rPr>
-        <w:t xml:space="preserve">[NEW] </w:t>
-      </w:r>
-      <w:r>
-        <w:rPr>
-          <w:sz w:val="18"/>
-        </w:rPr>
-        <w:t>Add HNP Conflict Handling Style Assessment (HNP-CHS)</w:t>
-      </w:r>
-    </w:p>
-    <w:p>
-      <w:pPr>
-        <w:ind w:left="720"/>
-      </w:pPr>
-      <w:r>
-        <w:rPr>
-          <w:i/>
-          <w:color w:val="6B7C93"/>
-          <w:sz w:val="16"/>
-        </w:rPr>
-        <w:t>New individual-level instrument (24 items, 6 categories) measuring conflict</w:t>
-      </w:r>
-    </w:p>
-    <w:p>
-      <w:pPr>
-        <w:pStyle w:val="ListBullet"/>
-      </w:pPr>
-      <w:r>
-        <w:rPr>
-          <w:b/>
-          <w:color w:val="3A9FD6"/>
-          <w:sz w:val="16"/>
-        </w:rPr>
-        <w:t xml:space="preserve">[NEW] </w:t>
-      </w:r>
-      <w:r>
-        <w:rPr>
-          <w:sz w:val="18"/>
-        </w:rPr>
-        <w:t>Generate toolkit PDFs and upload to S3, wire download buttons</w:t>
-      </w:r>
-    </w:p>
-    <w:p>
-      <w:pPr>
-        <w:ind w:left="720"/>
-      </w:pPr>
-      <w:r>
-        <w:rPr>
-          <w:i/>
-          <w:color w:val="6B7C93"/>
-          <w:sz w:val="16"/>
-        </w:rPr>
-        <w:t>Create 7 Interest-Based Negotiation Toolkit worksheets as PDFs using</w:t>
-      </w:r>
-    </w:p>
-    <w:p>
-      <w:pPr>
-        <w:pStyle w:val="ListBullet"/>
-      </w:pPr>
-      <w:r>
-        <w:rPr>
-          <w:b/>
-          <w:color w:val="3A9FD6"/>
-          <w:sz w:val="16"/>
-        </w:rPr>
-        <w:t xml:space="preserve">[CHORE] </w:t>
-      </w:r>
-      <w:r>
-        <w:rPr>
-          <w:sz w:val="18"/>
-        </w:rPr>
-        <w:t>Update todo, conflict design doc, remove stale changelog</w:t>
-      </w:r>
-    </w:p>
-    <w:p>
-      <w:pPr>
-        <w:pBdr>
-          <w:bottom w:val="single" w:sz="4" w:space="1" w:color="3A9FD6"/>
-        </w:pBdr>
-      </w:pPr>
-      <w:r>
-        <w:rPr>
-          <w:b/>
-          <w:color w:val="1B2A47"/>
-          <w:sz w:val="22"/>
-        </w:rPr>
-        <w:t>AI &amp; Intake Instruments</w:t>
-      </w:r>
-    </w:p>
-    <w:p>
-      <w:pPr>
-        <w:pStyle w:val="ListBullet"/>
-      </w:pPr>
-      <w:r>
-        <w:rPr>
-          <w:b/>
-          <w:color w:val="3A9FD6"/>
-          <w:sz w:val="16"/>
-        </w:rPr>
-        <w:t xml:space="preserve">[FIX] </w:t>
-      </w:r>
-      <w:r>
-        <w:rPr>
-          <w:sz w:val="18"/>
-        </w:rPr>
-        <w:t>Blank open-text field instead of showing the literal 'undefined'</w:t>
-      </w:r>
-    </w:p>
-    <w:p>
-      <w:pPr>
-        <w:ind w:left="720"/>
-      </w:pPr>
-      <w:r>
-        <w:rPr>
-          <w:i/>
-          <w:color w:val="6B7C93"/>
-          <w:sz w:val="16"/>
-        </w:rPr>
-        <w:t>[value] bound to answers()[q.id] stringifies to "undefined" in the DOM</w:t>
-      </w:r>
-    </w:p>
-    <w:p>
-      <w:pPr>
-        <w:pStyle w:val="ListBullet"/>
-      </w:pPr>
-      <w:r>
-        <w:rPr>
-          <w:b/>
-          <w:color w:val="3A9FD6"/>
-          <w:sz w:val="16"/>
-        </w:rPr>
-        <w:t xml:space="preserve">[CHORE] </w:t>
-      </w:r>
-      <w:r>
-        <w:rPr>
-          <w:sz w:val="18"/>
-        </w:rPr>
-        <w:t>I18n design doc â€” EN + FR via Claude Code execution</w:t>
-      </w:r>
-    </w:p>
-    <w:p>
-      <w:pPr>
-        <w:ind w:left="720"/>
-      </w:pPr>
-      <w:r>
-        <w:rPr>
-          <w:i/>
-          <w:color w:val="6B7C93"/>
-          <w:sz w:val="16"/>
-        </w:rPr>
-        <w:t>Proposal for making ARTES multilingual. Targets English + French as the</w:t>
-      </w:r>
-    </w:p>
-    <w:p>
-      <w:pPr>
-        <w:pStyle w:val="ListBullet"/>
-      </w:pPr>
-      <w:r>
-        <w:rPr>
-          <w:b/>
-          <w:color w:val="3A9FD6"/>
-          <w:sz w:val="16"/>
-        </w:rPr>
-        <w:t xml:space="preserve">[UI] </w:t>
-      </w:r>
-      <w:r>
-        <w:rPr>
-          <w:sz w:val="18"/>
-        </w:rPr>
-        <w:t>Add intake module hero image to login carousel</w:t>
-      </w:r>
-    </w:p>
-    <w:p>
-      <w:pPr>
-        <w:pStyle w:val="ListBullet"/>
-      </w:pPr>
-      <w:r>
-        <w:rPr>
-          <w:b/>
-          <w:color w:val="3A9FD6"/>
-          <w:sz w:val="16"/>
-        </w:rPr>
-        <w:t xml:space="preserve">[FIX] </w:t>
-      </w:r>
-      <w:r>
-        <w:rPr>
-          <w:sz w:val="18"/>
-        </w:rPr>
-        <w:t>Add missing SURVEY translation keys</w:t>
-      </w:r>
-    </w:p>
-    <w:p>
-      <w:pPr>
-        <w:ind w:left="720"/>
-      </w:pPr>
-      <w:r>
-        <w:rPr>
-          <w:i/>
-          <w:color w:val="6B7C93"/>
-          <w:sz w:val="16"/>
-        </w:rPr>
-        <w:t>Adds descriptionHint, respondentInstructions, instructionsHint to</w:t>
-      </w:r>
-    </w:p>
-    <w:p>
-      <w:pPr>
-        <w:pStyle w:val="ListBullet"/>
-      </w:pPr>
-      <w:r>
-        <w:rPr>
-          <w:b/>
-          <w:color w:val="3A9FD6"/>
-          <w:sz w:val="16"/>
-        </w:rPr>
-        <w:t xml:space="preserve">[NEW] </w:t>
-      </w:r>
-      <w:r>
-        <w:rPr>
-          <w:sz w:val="18"/>
-        </w:rPr>
-        <w:t>Intake i18n â€” org language, AI translation, survey language switcher</w:t>
-      </w:r>
-    </w:p>
-    <w:p>
-      <w:pPr>
-        <w:ind w:left="720"/>
-      </w:pPr>
-      <w:r>
-        <w:rPr>
-          <w:i/>
-          <w:color w:val="6B7C93"/>
-          <w:sz w:val="16"/>
-        </w:rPr>
-        <w:t>Add defaultLanguage to organization settings</w:t>
-      </w:r>
-    </w:p>
-    <w:p>
-      <w:pPr>
-        <w:pStyle w:val="ListBullet"/>
-      </w:pPr>
-      <w:r>
-        <w:rPr>
-          <w:b/>
-          <w:color w:val="3A9FD6"/>
-          <w:sz w:val="16"/>
-        </w:rPr>
-        <w:t xml:space="preserve">[FIX] </w:t>
-      </w:r>
-      <w:r>
-        <w:rPr>
-          <w:sz w:val="18"/>
-        </w:rPr>
-        <w:t>Biometric login only prompts when stored session exists</w:t>
-      </w:r>
-    </w:p>
-    <w:p>
-      <w:pPr>
-        <w:ind w:left="720"/>
-      </w:pPr>
-      <w:r>
-        <w:rPr>
-          <w:i/>
-          <w:color w:val="6B7C93"/>
-          <w:sz w:val="16"/>
-        </w:rPr>
-        <w:t>Previously showed confusing "login failed" on first use when no refresh</w:t>
-      </w:r>
-    </w:p>
-    <w:p>
-      <w:pPr>
-        <w:pStyle w:val="ListBullet"/>
-      </w:pPr>
-      <w:r>
-        <w:rPr>
-          <w:b/>
-          <w:color w:val="3A9FD6"/>
-          <w:sz w:val="16"/>
-        </w:rPr>
-        <w:t xml:space="preserve">[FIX] </w:t>
-      </w:r>
-      <w:r>
-        <w:rPr>
-          <w:sz w:val="18"/>
-        </w:rPr>
-        <w:t>Add VIEW_ALL_USERS and MANAGE_INTAKE_TEMPLATES to coach role</w:t>
-      </w:r>
-    </w:p>
-    <w:p>
-      <w:pPr>
-        <w:ind w:left="720"/>
-      </w:pPr>
-      <w:r>
-        <w:rPr>
-          <w:i/>
-          <w:color w:val="6B7C93"/>
-          <w:sz w:val="16"/>
-        </w:rPr>
-        <w:t>Coaches could not see the user list when assigning intakes because</w:t>
-      </w:r>
-    </w:p>
-    <w:p>
-      <w:pPr>
-        <w:pBdr>
-          <w:bottom w:val="single" w:sz="4" w:space="1" w:color="3A9FD6"/>
-        </w:pBdr>
-      </w:pPr>
-      <w:r>
-        <w:rPr>
-          <w:b/>
-          <w:color w:val="1B2A47"/>
-          <w:sz w:val="22"/>
-        </w:rPr>
-        <w:t>Internationalisation (i18n)</w:t>
-      </w:r>
-    </w:p>
-    <w:p>
-      <w:pPr>
-        <w:pStyle w:val="ListBullet"/>
-      </w:pPr>
-      <w:r>
-        <w:rPr>
-          <w:b/>
-          <w:color w:val="3A9FD6"/>
-          <w:sz w:val="16"/>
-        </w:rPr>
-        <w:t xml:space="preserve">[NEW] </w:t>
-      </w:r>
-      <w:r>
-        <w:rPr>
-          <w:sz w:val="18"/>
-        </w:rPr>
-        <w:t>Phase 1 â€” foundation (ngx-translate, i18next, schema, switcher)</w:t>
-      </w:r>
-    </w:p>
-    <w:p>
-      <w:pPr>
-        <w:ind w:left="720"/>
-      </w:pPr>
-      <w:r>
-        <w:rPr>
-          <w:i/>
-          <w:color w:val="6B7C93"/>
-          <w:sz w:val="16"/>
-        </w:rPr>
-        <w:t>Installs ngx-translate (frontend) and i18next (backend). Adds</w:t>
-      </w:r>
-    </w:p>
-    <w:p>
-      <w:pPr>
-        <w:pStyle w:val="ListBullet"/>
-      </w:pPr>
-      <w:r>
-        <w:rPr>
-          <w:b/>
-          <w:color w:val="3A9FD6"/>
-          <w:sz w:val="16"/>
-        </w:rPr>
-        <w:t xml:space="preserve">[NEW] </w:t>
-      </w:r>
-      <w:r>
-        <w:rPr>
-          <w:sz w:val="18"/>
-        </w:rPr>
-        <w:t>Spanish language, notification labels, language fix, Phase 6 prep</w:t>
-      </w:r>
-    </w:p>
-    <w:p>
-      <w:pPr>
-        <w:ind w:left="720"/>
-      </w:pPr>
-      <w:r>
-        <w:rPr>
-          <w:i/>
-          <w:color w:val="6B7C93"/>
-          <w:sz w:val="16"/>
-        </w:rPr>
-        <w:t>Adds es.json (1576 keys), Spanish backend locale, 'es' in User model</w:t>
-      </w:r>
-    </w:p>
-    <w:p>
-      <w:pPr>
-        <w:pStyle w:val="ListBullet"/>
-      </w:pPr>
-      <w:r>
-        <w:rPr>
-          <w:b/>
-          <w:color w:val="3A9FD6"/>
-          <w:sz w:val="16"/>
-        </w:rPr>
-        <w:t xml:space="preserve">[NEW] </w:t>
-      </w:r>
-      <w:r>
-        <w:rPr>
-          <w:sz w:val="18"/>
-        </w:rPr>
-        <w:t>Phase 6 locale-aware dates/numbers + login language fix</w:t>
-      </w:r>
-    </w:p>
-    <w:p>
-      <w:pPr>
-        <w:ind w:left="720"/>
-      </w:pPr>
-      <w:r>
-        <w:rPr>
-          <w:i/>
-          <w:color w:val="6B7C93"/>
-          <w:sz w:val="16"/>
-        </w:rPr>
-        <w:t>Replaces 26 hardcoded locale strings (en-US/en-GB) with dynamic language</w:t>
-      </w:r>
-    </w:p>
-    <w:p>
-      <w:pPr>
-        <w:pStyle w:val="ListBullet"/>
-      </w:pPr>
-      <w:r>
-        <w:rPr>
-          <w:b/>
-          <w:color w:val="3A9FD6"/>
-          <w:sz w:val="16"/>
-        </w:rPr>
-        <w:t xml:space="preserve">[FIX] </w:t>
-      </w:r>
-      <w:r>
-        <w:rPr>
-          <w:sz w:val="18"/>
-        </w:rPr>
-        <w:t>Sidebar flag picker uses DomSanitizer for SVG rendering</w:t>
-      </w:r>
-    </w:p>
-    <w:p>
-      <w:pPr>
-        <w:ind w:left="720"/>
-      </w:pPr>
-      <w:r>
-        <w:rPr>
-          <w:i/>
-          <w:color w:val="6B7C93"/>
-          <w:sz w:val="16"/>
-        </w:rPr>
-        <w:t>Angular strips SVG from innerHTML by default. Uses</w:t>
-      </w:r>
-    </w:p>
-    <w:p>
-      <w:pPr>
-        <w:pStyle w:val="ListBullet"/>
-      </w:pPr>
-      <w:r>
-        <w:rPr>
-          <w:b/>
-          <w:color w:val="3A9FD6"/>
-          <w:sz w:val="16"/>
-        </w:rPr>
-        <w:t xml:space="preserve">[NEW] </w:t>
-      </w:r>
-      <w:r>
-        <w:rPr>
-          <w:sz w:val="18"/>
-        </w:rPr>
-        <w:t>Flag language picker in sidebar using mat-menu</w:t>
-      </w:r>
-    </w:p>
-    <w:p>
-      <w:pPr>
-        <w:ind w:left="720"/>
-      </w:pPr>
-      <w:r>
-        <w:rPr>
-          <w:i/>
-          <w:color w:val="6B7C93"/>
-          <w:sz w:val="16"/>
-        </w:rPr>
-        <w:t>SVG flags rendered directly in template via @switch (no innerHTML).</w:t>
-      </w:r>
-    </w:p>
-    <w:p>
-      <w:pPr>
-        <w:pStyle w:val="ListBullet"/>
-      </w:pPr>
-      <w:r>
-        <w:rPr>
-          <w:b/>
-          <w:color w:val="3A9FD6"/>
-          <w:sz w:val="16"/>
-        </w:rPr>
-        <w:t xml:space="preserve">[FIX] </w:t>
-      </w:r>
-      <w:r>
-        <w:rPr>
-          <w:sz w:val="18"/>
-        </w:rPr>
-        <w:t>Req.t fallback for auth routes where i18n middleware hasn't run</w:t>
-      </w:r>
-    </w:p>
-    <w:p>
-      <w:pPr>
-        <w:ind w:left="720"/>
-      </w:pPr>
-      <w:r>
-        <w:rPr>
-          <w:i/>
-          <w:color w:val="6B7C93"/>
-          <w:sz w:val="16"/>
-        </w:rPr>
-        <w:t>All controllers now use a safe t(req, key, opts?) helper that falls back</w:t>
-      </w:r>
-    </w:p>
-    <w:p>
-      <w:pPr>
-        <w:pBdr>
-          <w:bottom w:val="single" w:sz="4" w:space="1" w:color="3A9FD6"/>
-        </w:pBdr>
-      </w:pPr>
-      <w:r>
-        <w:rPr>
-          <w:b/>
-          <w:color w:val="1B2A47"/>
-          <w:sz w:val="22"/>
-        </w:rPr>
-        <w:t>Mobile App (Ionic / Capacitor)</w:t>
-      </w:r>
-    </w:p>
-    <w:p>
-      <w:pPr>
-        <w:pStyle w:val="ListBullet"/>
-      </w:pPr>
-      <w:r>
-        <w:rPr>
-          <w:b/>
-          <w:color w:val="3A9FD6"/>
-          <w:sz w:val="16"/>
-        </w:rPr>
-        <w:t xml:space="preserve">[UI] </w:t>
-      </w:r>
-      <w:r>
-        <w:rPr>
-          <w:sz w:val="18"/>
-        </w:rPr>
-        <w:t>Mobile login - hide brand bar, compact card centered on gradient</w:t>
-      </w:r>
-    </w:p>
-    <w:p>
-      <w:pPr>
-        <w:pStyle w:val="ListBullet"/>
-      </w:pPr>
-      <w:r>
-        <w:rPr>
-          <w:b/>
-          <w:color w:val="3A9FD6"/>
-          <w:sz w:val="16"/>
-        </w:rPr>
-        <w:t xml:space="preserve">[NEW] </w:t>
-      </w:r>
-      <w:r>
-        <w:rPr>
-          <w:sz w:val="18"/>
-        </w:rPr>
-        <w:t>Functional org theme system â€” apply on save, logo, CSS var audit</w:t>
-      </w:r>
-    </w:p>
-    <w:p>
-      <w:pPr>
-        <w:ind w:left="720"/>
-      </w:pPr>
-      <w:r>
-        <w:rPr>
-          <w:i/>
-          <w:color w:val="6B7C93"/>
-          <w:sz w:val="16"/>
-        </w:rPr>
-        <w:t>Theme now applies immediately after saving in org settings (was missing</w:t>
-      </w:r>
-    </w:p>
-    <w:p>
-      <w:pPr>
-        <w:pStyle w:val="ListBullet"/>
-      </w:pPr>
-      <w:r>
-        <w:rPr>
-          <w:b/>
-          <w:color w:val="3A9FD6"/>
-          <w:sz w:val="16"/>
-        </w:rPr>
-        <w:t xml:space="preserve">[FIX] </w:t>
-      </w:r>
-      <w:r>
-        <w:rPr>
-          <w:sz w:val="18"/>
-        </w:rPr>
-        <w:t>Point to production API, add zone.js polyfill, network security config</w:t>
-      </w:r>
-    </w:p>
-    <w:p>
-      <w:pPr>
-        <w:pStyle w:val="ListBullet"/>
-      </w:pPr>
-      <w:r>
-        <w:rPr>
-          <w:b/>
-          <w:color w:val="3A9FD6"/>
-          <w:sz w:val="16"/>
-        </w:rPr>
-        <w:t xml:space="preserve">[FIX] </w:t>
-      </w:r>
-      <w:r>
-        <w:rPr>
-          <w:sz w:val="18"/>
-        </w:rPr>
-        <w:t>Allow Capacitor mobile origins in CORS config</w:t>
-      </w:r>
-    </w:p>
-    <w:p>
-      <w:pPr>
-        <w:ind w:left="720"/>
-      </w:pPr>
-      <w:r>
-        <w:rPr>
-          <w:i/>
-          <w:color w:val="6B7C93"/>
-          <w:sz w:val="16"/>
-        </w:rPr>
-        <w:t>Capacitor apps run from https://localhost which needs to be in the</w:t>
-      </w:r>
-    </w:p>
-    <w:p>
-      <w:pPr>
-        <w:pStyle w:val="ListBullet"/>
-      </w:pPr>
-      <w:r>
-        <w:rPr>
-          <w:b/>
-          <w:color w:val="3A9FD6"/>
-          <w:sz w:val="16"/>
-        </w:rPr>
-        <w:t xml:space="preserve">[FIX] </w:t>
-      </w:r>
-      <w:r>
-        <w:rPr>
-          <w:sz w:val="18"/>
-        </w:rPr>
-        <w:t>Skip reCAPTCHA for native mobile app requests</w:t>
-      </w:r>
-    </w:p>
-    <w:p>
-      <w:pPr>
-        <w:ind w:left="720"/>
-      </w:pPr>
-      <w:r>
-        <w:rPr>
-          <w:i/>
-          <w:color w:val="6B7C93"/>
-          <w:sz w:val="16"/>
-        </w:rPr>
-        <w:t>Native Capacitor apps originate from https://localhost and cannot run</w:t>
-      </w:r>
-    </w:p>
-    <w:p>
-      <w:pPr>
-        <w:pStyle w:val="ListBullet"/>
-      </w:pPr>
-      <w:r>
-        <w:rPr>
-          <w:b/>
-          <w:color w:val="3A9FD6"/>
-          <w:sz w:val="16"/>
-        </w:rPr>
-        <w:t xml:space="preserve">[FIX] </w:t>
-      </w:r>
-      <w:r>
-        <w:rPr>
-          <w:sz w:val="18"/>
-        </w:rPr>
-        <w:t>Disable push registration until Firebase is configured</w:t>
-      </w:r>
-    </w:p>
-    <w:p>
-      <w:pPr>
-        <w:ind w:left="720"/>
-      </w:pPr>
-      <w:r>
-        <w:rPr>
-          <w:i/>
-          <w:color w:val="6B7C93"/>
-          <w:sz w:val="16"/>
-        </w:rPr>
-        <w:t>PushNotifications.register() crashes the app with a native Java exception</w:t>
-      </w:r>
-    </w:p>
-    <w:p>
-      <w:pPr>
-        <w:pStyle w:val="ListBullet"/>
-      </w:pPr>
-      <w:r>
-        <w:rPr>
-          <w:b/>
-          <w:color w:val="3A9FD6"/>
-          <w:sz w:val="16"/>
-        </w:rPr>
-        <w:t xml:space="preserve">[NEW] </w:t>
-      </w:r>
-      <w:r>
-        <w:rPr>
-          <w:sz w:val="18"/>
-        </w:rPr>
-        <w:t>Enable push notifications with Firebase</w:t>
-      </w:r>
-    </w:p>
-    <w:p>
-      <w:pPr>
-        <w:ind w:left="720"/>
-      </w:pPr>
-      <w:r>
-        <w:rPr>
-          <w:i/>
-          <w:color w:val="6B7C93"/>
-          <w:sz w:val="16"/>
-        </w:rPr>
-        <w:t>Added google-services.json, re-enabled PushNotifications.register()</w:t>
-      </w:r>
-    </w:p>
-    <w:p>
-      <w:pPr>
-        <w:pStyle w:val="ListBullet"/>
-      </w:pPr>
-      <w:r>
-        <w:rPr>
-          <w:b/>
-          <w:color w:val="3A9FD6"/>
-          <w:sz w:val="16"/>
-        </w:rPr>
-        <w:t xml:space="preserve">[NEW] </w:t>
-      </w:r>
-      <w:r>
-        <w:rPr>
-          <w:sz w:val="18"/>
-        </w:rPr>
-        <w:t>Active login sessions â€” view and revoke from profile + admin panel</w:t>
-      </w:r>
-    </w:p>
-    <w:p>
-      <w:pPr>
-        <w:ind w:left="720"/>
-      </w:pPr>
-      <w:r>
-        <w:rPr>
-          <w:i/>
-          <w:color w:val="6B7C93"/>
-          <w:sz w:val="16"/>
-        </w:rPr>
-        <w:t>LoginSession model tracks device, IP, and last activity per login</w:t>
-      </w:r>
-    </w:p>
-    <w:p>
-      <w:pPr>
-        <w:pStyle w:val="ListBullet"/>
-      </w:pPr>
-      <w:r>
-        <w:rPr>
-          <w:b/>
-          <w:color w:val="3A9FD6"/>
-          <w:sz w:val="16"/>
-        </w:rPr>
-        <w:t xml:space="preserve">[FIX] </w:t>
-      </w:r>
-      <w:r>
-        <w:rPr>
-          <w:sz w:val="18"/>
-        </w:rPr>
-        <w:t>Call /auth/logout on sign out to remove login session</w:t>
-      </w:r>
-    </w:p>
-    <w:p>
-      <w:pPr>
-        <w:pStyle w:val="ListBullet"/>
-      </w:pPr>
-      <w:r>
-        <w:rPr>
-          <w:b/>
-          <w:color w:val="3A9FD6"/>
-          <w:sz w:val="16"/>
-        </w:rPr>
-        <w:t xml:space="preserve">[FIX] </w:t>
-      </w:r>
-      <w:r>
-        <w:rPr>
-          <w:sz w:val="18"/>
-        </w:rPr>
-        <w:t>Replace scale slider with numbered button grid, fix forced-choice text cutoff</w:t>
-      </w:r>
-    </w:p>
-    <w:p>
-      <w:pPr>
-        <w:ind w:left="720"/>
-      </w:pPr>
-      <w:r>
-        <w:rPr>
-          <w:i/>
-          <w:color w:val="6B7C93"/>
-          <w:sz w:val="16"/>
-        </w:rPr>
-        <w:t>Scale questions now show a 5-column grid of numbered buttons with</w:t>
-      </w:r>
-    </w:p>
-    <w:p>
-      <w:pPr>
-        <w:pStyle w:val="ListBullet"/>
-      </w:pPr>
-      <w:r>
-        <w:rPr>
-          <w:b/>
-          <w:color w:val="3A9FD6"/>
-          <w:sz w:val="16"/>
-        </w:rPr>
-        <w:t xml:space="preserve">[FIX] </w:t>
-      </w:r>
-      <w:r>
-        <w:rPr>
-          <w:sz w:val="18"/>
-        </w:rPr>
-        <w:t>Install CocoaPods before cap sync ios</w:t>
-      </w:r>
-    </w:p>
-    <w:p>
-      <w:pPr>
-        <w:ind w:left="720"/>
-      </w:pPr>
-      <w:r>
-        <w:rPr>
-          <w:i/>
-          <w:color w:val="6B7C93"/>
-          <w:sz w:val="16"/>
-        </w:rPr>
-        <w:t>The cap sync ios step fails on the GitHub Actions runner because</w:t>
-      </w:r>
-    </w:p>
-    <w:p>
-      <w:pPr>
-        <w:pStyle w:val="ListBullet"/>
-      </w:pPr>
-      <w:r>
-        <w:rPr>
-          <w:b/>
-          <w:color w:val="3A9FD6"/>
-          <w:sz w:val="16"/>
-        </w:rPr>
-        <w:t xml:space="preserve">[FIX] </w:t>
-      </w:r>
-      <w:r>
-        <w:rPr>
-          <w:sz w:val="18"/>
-        </w:rPr>
-        <w:t>Prevent duplicate survey submissions across devices</w:t>
-      </w:r>
-    </w:p>
-    <w:p>
-      <w:pPr>
-        <w:ind w:left="720"/>
-      </w:pPr>
-      <w:r>
-        <w:rPr>
-          <w:i/>
-          <w:color w:val="6B7C93"/>
-          <w:sz w:val="16"/>
-        </w:rPr>
-        <w:t>Survey list now checks completion status per template via /surveys/check</w:t>
-      </w:r>
-    </w:p>
-    <w:p>
-      <w:pPr>
-        <w:pStyle w:val="ListBullet"/>
-      </w:pPr>
-      <w:r>
-        <w:rPr>
-          <w:b/>
-          <w:color w:val="3A9FD6"/>
-          <w:sz w:val="16"/>
-        </w:rPr>
-        <w:t xml:space="preserve">[FIX] </w:t>
-      </w:r>
-      <w:r>
-        <w:rPr>
-          <w:sz w:val="18"/>
-        </w:rPr>
-        <w:t>Use Node 22 for iOS build â€” Capacitor 8 requires &gt;=22</w:t>
-      </w:r>
-    </w:p>
-    <w:p>
-      <w:pPr>
-        <w:pBdr>
-          <w:bottom w:val="single" w:sz="4" w:space="1" w:color="3A9FD6"/>
-        </w:pBdr>
-      </w:pPr>
-      <w:r>
-        <w:rPr>
-          <w:b/>
-          <w:color w:val="1B2A47"/>
-          <w:sz w:val="22"/>
-        </w:rPr>
-        <w:t>Authentication &amp; Security</w:t>
-      </w:r>
-    </w:p>
-    <w:p>
-      <w:pPr>
-        <w:pStyle w:val="ListBullet"/>
-      </w:pPr>
-      <w:r>
-        <w:rPr>
-          <w:b/>
-          <w:color w:val="3A9FD6"/>
-          <w:sz w:val="16"/>
-        </w:rPr>
-        <w:t xml:space="preserve">[CHORE] </w:t>
-      </w:r>
-      <w:r>
-        <w:rPr>
-          <w:sz w:val="18"/>
-        </w:rPr>
         <w:t>Skip warning on pure _id lookups</w:t>
-      </w:r>
-    </w:p>
-    <w:p>
-      <w:pPr>
-        <w:ind w:left="720"/>
-      </w:pPr>
-      <w:r>
-        <w:rPr>
-          <w:i/>
-          <w:color w:val="6B7C93"/>
-          <w:sz w:val="16"/>
-        </w:rPr>
-        <w:t>Mongoose populate() fires many {_id: ...} queries internally that</w:t>
-      </w:r>
-    </w:p>
-    <w:p>
-      <w:pPr>
-        <w:pStyle w:val="ListBullet"/>
-      </w:pPr>
-      <w:r>
-        <w:rPr>
-          <w:b/>
-          <w:color w:val="3A9FD6"/>
-          <w:sz w:val="16"/>
-        </w:rPr>
-        <w:t xml:space="preserve">[FIX] </w:t>
-      </w:r>
-      <w:r>
-        <w:rPr>
-          <w:sz w:val="18"/>
-        </w:rPr>
-        <w:t>Trust proxy for rate limits + robust inactivity tracking</w:t>
-      </w:r>
-    </w:p>
-    <w:p>
-      <w:pPr>
-        <w:ind w:left="720"/>
-      </w:pPr>
-      <w:r>
-        <w:rPr>
-          <w:i/>
-          <w:color w:val="6B7C93"/>
-          <w:sz w:val="16"/>
-        </w:rPr>
-        <w:t>Backend ran behind Apache without app.set('trust proxy', 1), so</w:t>
-      </w:r>
-    </w:p>
-    <w:p>
-      <w:pPr>
-        <w:pStyle w:val="ListBullet"/>
-      </w:pPr>
-      <w:r>
-        <w:rPr>
-          <w:b/>
-          <w:color w:val="3A9FD6"/>
-          <w:sz w:val="16"/>
-        </w:rPr>
-        <w:t xml:space="preserve">[FIX] </w:t>
-      </w:r>
-      <w:r>
-        <w:rPr>
-          <w:sz w:val="18"/>
-        </w:rPr>
-        <w:t>'Show all sessions' link â€” react to query-param changes</w:t>
-      </w:r>
-    </w:p>
-    <w:p>
-      <w:pPr>
-        <w:ind w:left="720"/>
-      </w:pPr>
-      <w:r>
-        <w:rPr>
-          <w:i/>
-          <w:color w:val="6B7C93"/>
-          <w:sz w:val="16"/>
-        </w:rPr>
-        <w:t>The page read ?sessionId= once in ngOnInit via route.snapshot, so</w:t>
-      </w:r>
-    </w:p>
-    <w:p>
-      <w:pPr>
-        <w:pStyle w:val="ListBullet"/>
-      </w:pPr>
-      <w:r>
-        <w:rPr>
-          <w:b/>
-          <w:color w:val="3A9FD6"/>
-          <w:sz w:val="16"/>
-        </w:rPr>
-        <w:t xml:space="preserve">[FIX] </w:t>
-      </w:r>
-      <w:r>
-        <w:rPr>
-          <w:sz w:val="18"/>
-        </w:rPr>
-        <w:t>Constrain info panel to viewport, center stats, fix dot styles</w:t>
-      </w:r>
-    </w:p>
-    <w:p>
-      <w:pPr>
-        <w:ind w:left="720"/>
-      </w:pPr>
-      <w:r>
-        <w:rPr>
-          <w:i/>
-          <w:color w:val="6B7C93"/>
-          <w:sz w:val="16"/>
-        </w:rPr>
-        <w:t>Info panel uses height: 100vh, no overflow scroll. Carousel slides fill</w:t>
-      </w:r>
-    </w:p>
-    <w:p>
-      <w:pPr>
-        <w:pStyle w:val="ListBullet"/>
-      </w:pPr>
-      <w:r>
-        <w:rPr>
-          <w:b/>
-          <w:color w:val="3A9FD6"/>
-          <w:sz w:val="16"/>
-        </w:rPr>
-        <w:t xml:space="preserve">[FIX] </w:t>
-      </w:r>
-      <w:r>
-        <w:rPr>
-          <w:sz w:val="18"/>
-        </w:rPr>
-        <w:t>Filter out conversations with deleted/missing partner users</w:t>
-      </w:r>
-    </w:p>
-    <w:p>
-      <w:pPr>
-        <w:ind w:left="720"/>
-      </w:pPr>
-      <w:r>
-        <w:rPr>
-          <w:i/>
-          <w:color w:val="6B7C93"/>
-          <w:sz w:val="16"/>
-        </w:rPr>
-        <w:t>User.findById returns null when the partner user was deleted or is in</w:t>
-      </w:r>
-    </w:p>
-    <w:p>
-      <w:pPr>
-        <w:pStyle w:val="ListBullet"/>
-      </w:pPr>
-      <w:r>
-        <w:rPr>
-          <w:b/>
-          <w:color w:val="3A9FD6"/>
-          <w:sz w:val="16"/>
-        </w:rPr>
-        <w:t xml:space="preserve">[FIX] </w:t>
-      </w:r>
-      <w:r>
-        <w:rPr>
-          <w:sz w:val="18"/>
-        </w:rPr>
-        <w:t>Auto-mark orphaned messages as read to fix badge count</w:t>
-      </w:r>
-    </w:p>
-    <w:p>
-      <w:pPr>
-        <w:ind w:left="720"/>
-      </w:pPr>
-      <w:r>
-        <w:rPr>
-          <w:i/>
-          <w:color w:val="6B7C93"/>
-          <w:sz w:val="16"/>
-        </w:rPr>
-        <w:t>When a message sender no longer exists (deleted user, cross-org system</w:t>
-      </w:r>
-    </w:p>
-    <w:p>
-      <w:pPr>
-        <w:pStyle w:val="ListBullet"/>
-      </w:pPr>
-      <w:r>
-        <w:rPr>
-          <w:b/>
-          <w:color w:val="3A9FD6"/>
-          <w:sz w:val="16"/>
-        </w:rPr>
-        <w:t xml:space="preserve">[FIX] </w:t>
-      </w:r>
-      <w:r>
-        <w:rPr>
-          <w:sz w:val="18"/>
-        </w:rPr>
-        <w:t>Replace MSAL with direct HTTP for Microsoft token exchange/refresh</w:t>
-      </w:r>
-    </w:p>
-    <w:p>
-      <w:pPr>
-        <w:ind w:left="720"/>
-      </w:pPr>
-      <w:r>
-        <w:rPr>
-          <w:i/>
-          <w:color w:val="6B7C93"/>
-          <w:sz w:val="16"/>
-        </w:rPr>
-        <w:t>MSAL's acquireTokenByCode failed with invalid_client on the common</w:t>
-      </w:r>
-    </w:p>
-    <w:p>
-      <w:pPr>
-        <w:pStyle w:val="ListBullet"/>
-      </w:pPr>
-      <w:r>
-        <w:rPr>
-          <w:b/>
-          <w:color w:val="3A9FD6"/>
-          <w:sz w:val="16"/>
-        </w:rPr>
-        <w:t xml:space="preserve">[SECURITY] </w:t>
-      </w:r>
-      <w:r>
-        <w:rPr>
-          <w:sz w:val="18"/>
-        </w:rPr>
-        <w:t>Remove Azure client secrets from tracked file</w:t>
-      </w:r>
-    </w:p>
-    <w:p>
-      <w:pPr>
-        <w:ind w:left="720"/>
-      </w:pPr>
-      <w:r>
-        <w:rPr>
-          <w:i/>
-          <w:color w:val="6B7C93"/>
-          <w:sz w:val="16"/>
-        </w:rPr>
-        <w:t>Secrets were in docs/design/Azure Setup.txt â€” replaced with placeholders.</w:t>
-      </w:r>
-    </w:p>
-    <w:p>
-      <w:pPr>
-        <w:pStyle w:val="ListBullet"/>
-      </w:pPr>
-      <w:r>
-        <w:rPr>
-          <w:b/>
-          <w:color w:val="3A9FD6"/>
-          <w:sz w:val="16"/>
-        </w:rPr>
-        <w:t xml:space="preserve">[NEW] </w:t>
-      </w:r>
-      <w:r>
-        <w:rPr>
-          <w:sz w:val="18"/>
-        </w:rPr>
-        <w:t>Legal pages, cookie consent, app footer, carousel animation</w:t>
-      </w:r>
-    </w:p>
-    <w:p>
-      <w:pPr>
-        <w:ind w:left="720"/>
-      </w:pPr>
-      <w:r>
-        <w:rPr>
-          <w:i/>
-          <w:color w:val="6B7C93"/>
-          <w:sz w:val="16"/>
-        </w:rPr>
-        <w:t>Public pages at /termsofservice, /privacystatement, /eula covering</w:t>
-      </w:r>
-    </w:p>
-    <w:p>
-      <w:pPr>
-        <w:pStyle w:val="ListBullet"/>
-      </w:pPr>
-      <w:r>
-        <w:rPr>
-          <w:b/>
-          <w:color w:val="3A9FD6"/>
-          <w:sz w:val="16"/>
-        </w:rPr>
-        <w:t xml:space="preserve">[FIX] </w:t>
-      </w:r>
-      <w:r>
-        <w:rPr>
-          <w:sz w:val="18"/>
-        </w:rPr>
-        <w:t>Org logo in sidebar switcher, carousel pause button + hover pause</w:t>
-      </w:r>
-    </w:p>
-    <w:p>
-      <w:pPr>
-        <w:ind w:left="720"/>
-      </w:pPr>
-      <w:r>
-        <w:rPr>
-          <w:i/>
-          <w:color w:val="6B7C93"/>
-          <w:sz w:val="16"/>
-        </w:rPr>
-        <w:t>Org logo now replaces the business icon in the org-switcher row (not the</w:t>
-      </w:r>
-    </w:p>
-    <w:p>
-      <w:pPr>
-        <w:pStyle w:val="ListBullet"/>
-      </w:pPr>
-      <w:r>
-        <w:rPr>
-          <w:b/>
-          <w:color w:val="3A9FD6"/>
-          <w:sz w:val="16"/>
-        </w:rPr>
-        <w:t xml:space="preserve">[NEW] </w:t>
-      </w:r>
-      <w:r>
-        <w:rPr>
-          <w:sz w:val="18"/>
-        </w:rPr>
-        <w:t>Reorder tabs, auto-select unread tab, auto-open on login</w:t>
-      </w:r>
-    </w:p>
-    <w:p>
-      <w:pPr>
-        <w:ind w:left="720"/>
-      </w:pPr>
-      <w:r>
-        <w:rPr>
-          <w:i/>
-          <w:color w:val="6B7C93"/>
-          <w:sz w:val="16"/>
-        </w:rPr>
-        <w:t>Notifications tab first, messages second</w:t>
-      </w:r>
-    </w:p>
-    <w:p>
-      <w:pPr>
-        <w:pStyle w:val="ListBullet"/>
-      </w:pPr>
-      <w:r>
-        <w:rPr>
-          <w:b/>
-          <w:color w:val="3A9FD6"/>
-          <w:sz w:val="16"/>
-        </w:rPr>
-        <w:t xml:space="preserve">[NEW] </w:t>
-      </w:r>
-      <w:r>
-        <w:rPr>
-          <w:sz w:val="18"/>
-        </w:rPr>
-        <w:t>Add mark as read/unread toggle for messages and notifications</w:t>
-      </w:r>
-    </w:p>
-    <w:p>
-      <w:pPr>
-        <w:pStyle w:val="ListBullet"/>
-      </w:pPr>
-      <w:r>
-        <w:rPr>
-          <w:b/>
-          <w:color w:val="3A9FD6"/>
-          <w:sz w:val="16"/>
-        </w:rPr>
-        <w:t xml:space="preserve">[FIX] </w:t>
-      </w:r>
-      <w:r>
-        <w:rPr>
-          <w:sz w:val="18"/>
-        </w:rPr>
-        <w:t>Run reCAPTCHA callbacks inside NgZone so router.navigate triggers</w:t>
-      </w:r>
-    </w:p>
-    <w:p>
-      <w:pPr>
-        <w:ind w:left="720"/>
-      </w:pPr>
-      <w:r>
-        <w:rPr>
-          <w:i/>
-          <w:color w:val="6B7C93"/>
-          <w:sz w:val="16"/>
-        </w:rPr>
-        <w:t>The grecaptcha.ready/execute callbacks run outside Angular's zone,</w:t>
-      </w:r>
-    </w:p>
-    <w:p>
-      <w:pPr>
-        <w:pStyle w:val="ListBullet"/>
-      </w:pPr>
-      <w:r>
-        <w:rPr>
-          <w:b/>
-          <w:color w:val="3A9FD6"/>
-          <w:sz w:val="16"/>
-        </w:rPr>
-        <w:t xml:space="preserve">[CHORE] </w:t>
-      </w:r>
-      <w:r>
-        <w:rPr>
-          <w:sz w:val="18"/>
-        </w:rPr>
-        <w:t>Bump initial bundle budget warning to 650kb</w:t>
-      </w:r>
-    </w:p>
-    <w:p>
-      <w:pPr>
-        <w:pStyle w:val="ListBullet"/>
-      </w:pPr>
-      <w:r>
-        <w:rPr>
-          <w:b/>
-          <w:color w:val="3A9FD6"/>
-          <w:sz w:val="16"/>
-        </w:rPr>
-        <w:t xml:space="preserve">[FIX] </w:t>
-      </w:r>
-      <w:r>
-        <w:rPr>
-          <w:sz w:val="18"/>
-        </w:rPr>
-        <w:t>Hide reCAPTCHA badge, add inline attribution on protected forms</w:t>
-      </w:r>
-    </w:p>
-    <w:p>
-      <w:pPr>
-        <w:ind w:left="720"/>
-      </w:pPr>
-      <w:r>
-        <w:rPr>
-          <w:i/>
-          <w:color w:val="6B7C93"/>
-          <w:sz w:val="16"/>
-        </w:rPr>
-        <w:t>The floating badge was covering the footer legal links. Per Google's</w:t>
-      </w:r>
-    </w:p>
-    <w:p>
-      <w:pPr>
-        <w:pStyle w:val="ListBullet"/>
-      </w:pPr>
-      <w:r>
-        <w:rPr>
-          <w:b/>
-          <w:color w:val="3A9FD6"/>
-          <w:sz w:val="16"/>
-        </w:rPr>
-        <w:t xml:space="preserve">[FIX] </w:t>
-      </w:r>
-      <w:r>
-        <w:rPr>
-          <w:sz w:val="18"/>
-        </w:rPr>
-        <w:t>Strip iat/exp from decoded token before re-signing in refresh endpoint</w:t>
-      </w:r>
-    </w:p>
-    <w:p>
-      <w:pPr>
-        <w:ind w:left="720"/>
-      </w:pPr>
-      <w:r>
-        <w:rPr>
-          <w:i/>
-          <w:color w:val="6B7C93"/>
-          <w:sz w:val="16"/>
-        </w:rPr>
-        <w:t>jwt.sign() throws when payload contains 'exp' and options.expiresIn is set.</w:t>
-      </w:r>
-    </w:p>
-    <w:p>
-      <w:pPr>
-        <w:pStyle w:val="ListBullet"/>
-      </w:pPr>
-      <w:r>
-        <w:rPr>
-          <w:b/>
-          <w:color w:val="3A9FD6"/>
-          <w:sz w:val="16"/>
-        </w:rPr>
-        <w:t xml:space="preserve">[FIX] </w:t>
-      </w:r>
-      <w:r>
-        <w:rPr>
-          <w:sz w:val="18"/>
-        </w:rPr>
-        <w:t>Add page padding to admin login sessions page</w:t>
-      </w:r>
-    </w:p>
-    <w:p>
-      <w:pPr>
-        <w:pStyle w:val="ListBullet"/>
-      </w:pPr>
-      <w:r>
-        <w:rPr>
-          <w:b/>
-          <w:color w:val="3A9FD6"/>
-          <w:sz w:val="16"/>
-        </w:rPr>
-        <w:t xml:space="preserve">[FIX] </w:t>
-      </w:r>
-      <w:r>
-        <w:rPr>
-          <w:sz w:val="18"/>
-        </w:rPr>
-        <w:t>Logout cleans session, fix stale route ordering, admin refresh/clean buttons</w:t>
-      </w:r>
-    </w:p>
-    <w:p>
-      <w:pPr>
-        <w:ind w:left="720"/>
-      </w:pPr>
-      <w:r>
-        <w:rPr>
-          <w:i/>
-          <w:color w:val="6B7C93"/>
-          <w:sz w:val="16"/>
-        </w:rPr>
-        <w:t>POST /api/auth/logout removes current session record</w:t>
-      </w:r>
-    </w:p>
-    <w:p>
-      <w:pPr>
-        <w:pStyle w:val="ListBullet"/>
-      </w:pPr>
-      <w:r>
-        <w:rPr>
-          <w:b/>
-          <w:color w:val="3A9FD6"/>
-          <w:sz w:val="16"/>
-        </w:rPr>
-        <w:t xml:space="preserve">[FIX] </w:t>
-      </w:r>
-      <w:r>
-        <w:rPr>
-          <w:sz w:val="18"/>
-        </w:rPr>
-        <w:t>Hide revoke button for own session, add 'You' badge in admin sessions</w:t>
-      </w:r>
-    </w:p>
-    <w:p>
-      <w:pPr>
-        <w:pStyle w:val="ListBullet"/>
-      </w:pPr>
-      <w:r>
-        <w:rPr>
-          <w:b/>
-          <w:color w:val="3A9FD6"/>
-          <w:sz w:val="16"/>
-        </w:rPr>
-        <w:t xml:space="preserve">[FIX] </w:t>
-      </w:r>
-      <w:r>
-        <w:rPr>
-          <w:sz w:val="18"/>
-        </w:rPr>
-        <w:t>Deduplicate login sessions by userId+device+ip</w:t>
-      </w:r>
-    </w:p>
-    <w:p>
-      <w:pPr>
-        <w:pStyle w:val="ListBullet"/>
-      </w:pPr>
-      <w:r>
-        <w:rPr>
-          <w:b/>
-          <w:color w:val="3A9FD6"/>
-          <w:sz w:val="16"/>
-        </w:rPr>
-        <w:t xml:space="preserve">[FIX] </w:t>
-      </w:r>
-      <w:r>
-        <w:rPr>
-          <w:sz w:val="18"/>
-        </w:rPr>
-        <w:t>Rewrite toolkit PDFs â€” tight layout, inline content disposition</w:t>
-      </w:r>
-    </w:p>
-    <w:p>
-      <w:pPr>
-        <w:ind w:left="720"/>
-      </w:pPr>
-      <w:r>
-        <w:rPr>
-          <w:i/>
-          <w:color w:val="6B7C93"/>
-          <w:sz w:val="16"/>
-        </w:rPr>
-        <w:t>Rewrite all 7 PDF generators with compact spacing, proper page-break</w:t>
-      </w:r>
-    </w:p>
-    <w:p>
-      <w:pPr>
-        <w:pStyle w:val="ListBullet"/>
-      </w:pPr>
-      <w:r>
-        <w:rPr>
-          <w:b/>
-          <w:color w:val="3A9FD6"/>
-          <w:sz w:val="16"/>
-        </w:rPr>
-        <w:t xml:space="preserve">[CHORE] </w:t>
-      </w:r>
-      <w:r>
-        <w:rPr>
-          <w:sz w:val="18"/>
-        </w:rPr>
-        <w:t>Weekly changelog 2026-04-21</w:t>
-      </w:r>
-    </w:p>
-    <w:p>
-      <w:pPr>
-        <w:ind w:left="720"/>
-      </w:pPr>
-      <w:r>
-        <w:rPr>
-          <w:i/>
-          <w:color w:val="6B7C93"/>
-          <w:sz w:val="16"/>
-        </w:rPr>
-        <w:t>https://claude.ai/code/session_01U3fk2tTQkMg7Xkp76M1pdn</w:t>
-      </w:r>
-    </w:p>
-    <w:p>
-      <w:pPr>
-        <w:pStyle w:val="ListBullet"/>
-      </w:pPr>
-      <w:r>
-        <w:rPr>
-          <w:b/>
-          <w:color w:val="3A9FD6"/>
-          <w:sz w:val="16"/>
-        </w:rPr>
-        <w:t xml:space="preserve">[CHORE] </w:t>
-      </w:r>
-      <w:r>
-        <w:rPr>
-          <w:sz w:val="18"/>
-        </w:rPr>
-        <w:t>Add generate_changelog.py script for weekly .docx reports</w:t>
-      </w:r>
-    </w:p>
-    <w:p>
-      <w:pPr>
-        <w:ind w:left="720"/>
-      </w:pPr>
-      <w:r>
-        <w:rPr>
-          <w:i/>
-          <w:color w:val="6B7C93"/>
-          <w:sz w:val="16"/>
-        </w:rPr>
-        <w:t>https://claude.ai/code/session_01U3fk2tTQkMg7Xkp76M1pdn</w:t>
-      </w:r>
-    </w:p>
-    <w:p>
-      <w:pPr>
-        <w:pStyle w:val="ListBullet"/>
-      </w:pPr>
-      <w:r>
-        <w:rPr>
-          <w:b/>
-          <w:color w:val="3A9FD6"/>
-          <w:sz w:val="16"/>
-        </w:rPr>
-        <w:t xml:space="preserve">[CI] </w:t>
-      </w:r>
-      <w:r>
-        <w:rPr>
-          <w:sz w:val="18"/>
-        </w:rPr>
-        <w:t>Add weekly changelog GitHub Actions workflow (Tuesdays 09:00 UTC)</w:t>
-      </w:r>
-    </w:p>
-    <w:p>
-      <w:pPr>
-        <w:ind w:left="720"/>
-      </w:pPr>
-      <w:r>
-        <w:rPr>
-          <w:i/>
-          <w:color w:val="6B7C93"/>
-          <w:sz w:val="16"/>
-        </w:rPr>
-        <w:t>https://claude.ai/code/session_01U3fk2tTQkMg7Xkp76M1pdn</w:t>
       </w:r>
     </w:p>
     <w:p>

</xml_diff>